<commit_message>
Added feature flag for hiding the non-portion marking buttons and updated classified instructions for RDM and RDSB
</commit_message>
<xml_diff>
--- a/ClassifiedInstallationStuff/_Instructions/Initial IES Suite Installation Instuctions.docx
+++ b/ClassifiedInstallationStuff/_Instructions/Initial IES Suite Installation Instuctions.docx
@@ -37,17 +37,17 @@
         </w:rPr>
       </w:pPr>
     </w:p>
-    <w:bookmarkStart w:id="0" w:name="_Toc4596569" w:displacedByCustomXml="next"/>
-    <w:bookmarkStart w:id="1" w:name="_Toc426545466" w:displacedByCustomXml="next"/>
-    <w:bookmarkStart w:id="2" w:name="_Toc426545102" w:displacedByCustomXml="next"/>
-    <w:bookmarkStart w:id="3" w:name="_Toc426544400" w:displacedByCustomXml="next"/>
-    <w:bookmarkStart w:id="4" w:name="_Toc410652409" w:displacedByCustomXml="next"/>
+    <w:bookmarkStart w:id="0" w:name="_Toc515460341" w:displacedByCustomXml="next"/>
+    <w:bookmarkStart w:id="1" w:name="_Toc435089160" w:displacedByCustomXml="next"/>
+    <w:bookmarkStart w:id="2" w:name="_Toc402261032" w:displacedByCustomXml="next"/>
+    <w:bookmarkStart w:id="3" w:name="_Toc409096411" w:displacedByCustomXml="next"/>
+    <w:bookmarkStart w:id="4" w:name="_Toc410226779" w:displacedByCustomXml="next"/>
     <w:bookmarkStart w:id="5" w:name="_Toc410286731" w:displacedByCustomXml="next"/>
-    <w:bookmarkStart w:id="6" w:name="_Toc410226779" w:displacedByCustomXml="next"/>
-    <w:bookmarkStart w:id="7" w:name="_Toc409096411" w:displacedByCustomXml="next"/>
-    <w:bookmarkStart w:id="8" w:name="_Toc402261032" w:displacedByCustomXml="next"/>
-    <w:bookmarkStart w:id="9" w:name="_Toc435089160" w:displacedByCustomXml="next"/>
-    <w:bookmarkStart w:id="10" w:name="_Toc515460341" w:displacedByCustomXml="next"/>
+    <w:bookmarkStart w:id="6" w:name="_Toc410652409" w:displacedByCustomXml="next"/>
+    <w:bookmarkStart w:id="7" w:name="_Toc426544400" w:displacedByCustomXml="next"/>
+    <w:bookmarkStart w:id="8" w:name="_Toc426545102" w:displacedByCustomXml="next"/>
+    <w:bookmarkStart w:id="9" w:name="_Toc426545466" w:displacedByCustomXml="next"/>
+    <w:bookmarkStart w:id="10" w:name="_Toc4596569" w:displacedByCustomXml="next"/>
     <w:sdt>
       <w:sdtPr>
         <w:rPr>
@@ -75,8 +75,8 @@
         </w:rPr>
       </w:sdtEndPr>
       <w:sdtContent>
-        <w:bookmarkStart w:id="11" w:name="_Toc266280202" w:displacedByCustomXml="prev"/>
-        <w:bookmarkStart w:id="12" w:name="_Toc320016168" w:displacedByCustomXml="prev"/>
+        <w:bookmarkStart w:id="11" w:name="_Toc320016168" w:displacedByCustomXml="prev"/>
+        <w:bookmarkStart w:id="12" w:name="_Toc266280202" w:displacedByCustomXml="prev"/>
         <w:p>
           <w:pPr>
             <w:pStyle w:val="Heading1"/>
@@ -156,14 +156,7 @@
               <w:lang w:val="fr-FR"/>
             </w:rPr>
             <w:lastRenderedPageBreak/>
-            <w:t xml:space="preserve">Change </w:t>
-          </w:r>
-          <w:proofErr w:type="spellStart"/>
-          <w:r>
-            <w:rPr>
-              <w:lang w:val="fr-FR"/>
-            </w:rPr>
-            <w:t>History</w:t>
+            <w:t>Change History</w:t>
           </w:r>
           <w:bookmarkEnd w:id="12"/>
           <w:bookmarkEnd w:id="11"/>
@@ -171,7 +164,6 @@
           <w:bookmarkEnd w:id="14"/>
           <w:bookmarkEnd w:id="15"/>
           <w:bookmarkEnd w:id="16"/>
-          <w:proofErr w:type="spellEnd"/>
         </w:p>
         <w:p>
           <w:pPr>
@@ -1735,7 +1727,6 @@
       <w:r>
         <w:t xml:space="preserve"> account that the SSRS server will use. Name it </w:t>
       </w:r>
-      <w:proofErr w:type="spellStart"/>
       <w:r>
         <w:rPr>
           <w:rFonts w:ascii="Consolas" w:hAnsi="Consolas"/>
@@ -1744,7 +1735,6 @@
         </w:rPr>
         <w:t>generationReporter</w:t>
       </w:r>
-      <w:proofErr w:type="spellEnd"/>
       <w:r>
         <w:t xml:space="preserve"> or you will cause the DB scripts to keep failing.</w:t>
       </w:r>
@@ -1814,44 +1804,102 @@
           <w:color w:val="E36C0A" w:themeColor="accent6" w:themeShade="BF"/>
           <w:sz w:val="20"/>
         </w:rPr>
-        <w:t>us\</w:t>
-      </w:r>
-      <w:proofErr w:type="spellStart"/>
+        <w:t>us\EBS.EstimationInitiative.DevTeam</w:t>
+      </w:r>
+    </w:p>
+    <w:p>
+      <w:pPr>
+        <w:pStyle w:val="ListParagraph"/>
+        <w:numPr>
+          <w:ilvl w:val="1"/>
+          <w:numId w:val="2"/>
+        </w:numPr>
+      </w:pPr>
+      <w:r>
+        <w:t>User group – should reuse one from GenBOE if possible; will contain all application users; will be used by all apps</w:t>
+      </w:r>
+    </w:p>
+    <w:p>
+      <w:pPr>
+        <w:pStyle w:val="ListParagraph"/>
+        <w:numPr>
+          <w:ilvl w:val="1"/>
+          <w:numId w:val="2"/>
+        </w:numPr>
+      </w:pPr>
+      <w:r>
+        <w:t xml:space="preserve">Additional application specific groups for </w:t>
+      </w:r>
+      <w:r>
+        <w:t>PTM:</w:t>
+      </w:r>
+    </w:p>
+    <w:p>
+      <w:pPr>
+        <w:pStyle w:val="ListParagraph"/>
+        <w:numPr>
+          <w:ilvl w:val="2"/>
+          <w:numId w:val="2"/>
+        </w:numPr>
+      </w:pPr>
+      <w:r>
+        <w:t>LeadEstimators</w:t>
+      </w:r>
+    </w:p>
+    <w:p>
+      <w:pPr>
+        <w:pStyle w:val="ListParagraph"/>
+        <w:numPr>
+          <w:ilvl w:val="2"/>
+          <w:numId w:val="2"/>
+        </w:numPr>
+      </w:pPr>
+      <w:r>
+        <w:t>PricingVerification</w:t>
+      </w:r>
+    </w:p>
+    <w:p>
+      <w:pPr>
+        <w:pStyle w:val="ListParagraph"/>
+        <w:numPr>
+          <w:ilvl w:val="2"/>
+          <w:numId w:val="2"/>
+        </w:numPr>
+      </w:pPr>
+      <w:r>
+        <w:t>IndependentReviewers</w:t>
+      </w:r>
+    </w:p>
+    <w:p>
+      <w:pPr>
+        <w:pStyle w:val="ListParagraph"/>
+        <w:numPr>
+          <w:ilvl w:val="3"/>
+          <w:numId w:val="2"/>
+        </w:numPr>
+      </w:pPr>
+      <w:r>
+        <w:t>In our prod system, the above 3 are combined into a single group</w:t>
+      </w:r>
+    </w:p>
+    <w:p>
+      <w:pPr>
+        <w:pStyle w:val="ListParagraph"/>
+        <w:numPr>
+          <w:ilvl w:val="3"/>
+          <w:numId w:val="2"/>
+        </w:numPr>
+        <w:rPr>
+          <w:rFonts w:ascii="Consolas" w:hAnsi="Consolas"/>
+        </w:rPr>
+      </w:pPr>
       <w:r>
         <w:rPr>
           <w:rFonts w:ascii="Consolas" w:hAnsi="Consolas"/>
           <w:color w:val="E36C0A" w:themeColor="accent6" w:themeShade="BF"/>
           <w:sz w:val="20"/>
         </w:rPr>
-        <w:t>EBS.EstimationInitiative.DevTeam</w:t>
-      </w:r>
-      <w:proofErr w:type="spellEnd"/>
-    </w:p>
-    <w:p>
-      <w:pPr>
-        <w:pStyle w:val="ListParagraph"/>
-        <w:numPr>
-          <w:ilvl w:val="1"/>
-          <w:numId w:val="2"/>
-        </w:numPr>
-      </w:pPr>
-      <w:r>
-        <w:t>User group – should reuse one from GenBOE if possible; will contain all application users; will be used by all apps</w:t>
-      </w:r>
-    </w:p>
-    <w:p>
-      <w:pPr>
-        <w:pStyle w:val="ListParagraph"/>
-        <w:numPr>
-          <w:ilvl w:val="1"/>
-          <w:numId w:val="2"/>
-        </w:numPr>
-      </w:pPr>
-      <w:r>
-        <w:t xml:space="preserve">Additional application specific groups for </w:t>
-      </w:r>
-      <w:r>
-        <w:t>PTM:</w:t>
+        <w:t>us\EBS.IES.LeadEst.PricingVer.IndependentRev.Roles</w:t>
       </w:r>
     </w:p>
     <w:p>
@@ -1862,39 +1910,9 @@
           <w:numId w:val="2"/>
         </w:numPr>
       </w:pPr>
-      <w:proofErr w:type="spellStart"/>
-      <w:r>
-        <w:t>LeadEstimators</w:t>
-      </w:r>
-      <w:proofErr w:type="spellEnd"/>
-    </w:p>
-    <w:p>
-      <w:pPr>
-        <w:pStyle w:val="ListParagraph"/>
-        <w:numPr>
-          <w:ilvl w:val="2"/>
-          <w:numId w:val="2"/>
-        </w:numPr>
-      </w:pPr>
-      <w:proofErr w:type="spellStart"/>
-      <w:r>
-        <w:t>PricingVerification</w:t>
-      </w:r>
-      <w:proofErr w:type="spellEnd"/>
-    </w:p>
-    <w:p>
-      <w:pPr>
-        <w:pStyle w:val="ListParagraph"/>
-        <w:numPr>
-          <w:ilvl w:val="2"/>
-          <w:numId w:val="2"/>
-        </w:numPr>
-      </w:pPr>
-      <w:proofErr w:type="spellStart"/>
-      <w:r>
-        <w:t>IndependentReviewers</w:t>
-      </w:r>
-      <w:proofErr w:type="spellEnd"/>
+      <w:r>
+        <w:t>LOBLeads</w:t>
+      </w:r>
     </w:p>
     <w:p>
       <w:pPr>
@@ -1903,131 +1921,53 @@
           <w:ilvl w:val="3"/>
           <w:numId w:val="2"/>
         </w:numPr>
-      </w:pPr>
-      <w:r>
-        <w:t>In our prod system, the above 3 are combined into a single group</w:t>
-      </w:r>
-    </w:p>
-    <w:p>
-      <w:pPr>
-        <w:pStyle w:val="ListParagraph"/>
-        <w:numPr>
-          <w:ilvl w:val="3"/>
-          <w:numId w:val="2"/>
-        </w:numPr>
         <w:rPr>
           <w:rFonts w:ascii="Consolas" w:hAnsi="Consolas"/>
         </w:rPr>
       </w:pPr>
+      <w:r>
+        <w:t xml:space="preserve">Our value: </w:t>
+      </w:r>
       <w:r>
         <w:rPr>
           <w:rFonts w:ascii="Consolas" w:hAnsi="Consolas"/>
           <w:color w:val="E36C0A" w:themeColor="accent6" w:themeShade="BF"/>
           <w:sz w:val="20"/>
         </w:rPr>
-        <w:t>us\</w:t>
-      </w:r>
-      <w:proofErr w:type="spellStart"/>
+        <w:t>us\EBS.IES.LOBLeads</w:t>
+      </w:r>
+    </w:p>
+    <w:p>
+      <w:pPr>
+        <w:pStyle w:val="ListParagraph"/>
+        <w:numPr>
+          <w:ilvl w:val="2"/>
+          <w:numId w:val="2"/>
+        </w:numPr>
+      </w:pPr>
+      <w:r>
+        <w:t>CoverSheetApprovers</w:t>
+      </w:r>
+    </w:p>
+    <w:p>
+      <w:pPr>
+        <w:pStyle w:val="ListParagraph"/>
+        <w:numPr>
+          <w:ilvl w:val="3"/>
+          <w:numId w:val="2"/>
+        </w:numPr>
+      </w:pPr>
+      <w:r>
+        <w:t xml:space="preserve">Our value: </w:t>
+      </w:r>
       <w:r>
         <w:rPr>
           <w:rFonts w:ascii="Consolas" w:hAnsi="Consolas"/>
           <w:color w:val="E36C0A" w:themeColor="accent6" w:themeShade="BF"/>
           <w:sz w:val="20"/>
         </w:rPr>
-        <w:t>EBS.IES.LeadEst.PricingVer.IndependentRev.Roles</w:t>
-      </w:r>
-      <w:proofErr w:type="spellEnd"/>
-    </w:p>
-    <w:p>
-      <w:pPr>
-        <w:pStyle w:val="ListParagraph"/>
-        <w:numPr>
-          <w:ilvl w:val="2"/>
-          <w:numId w:val="2"/>
-        </w:numPr>
-      </w:pPr>
-      <w:proofErr w:type="spellStart"/>
-      <w:r>
-        <w:t>LOBLeads</w:t>
-      </w:r>
-      <w:proofErr w:type="spellEnd"/>
-    </w:p>
-    <w:p>
-      <w:pPr>
-        <w:pStyle w:val="ListParagraph"/>
-        <w:numPr>
-          <w:ilvl w:val="3"/>
-          <w:numId w:val="2"/>
-        </w:numPr>
-        <w:rPr>
-          <w:rFonts w:ascii="Consolas" w:hAnsi="Consolas"/>
-        </w:rPr>
-      </w:pPr>
-      <w:r>
-        <w:t xml:space="preserve">Our value: </w:t>
-      </w:r>
-      <w:r>
-        <w:rPr>
-          <w:rFonts w:ascii="Consolas" w:hAnsi="Consolas"/>
-          <w:color w:val="E36C0A" w:themeColor="accent6" w:themeShade="BF"/>
-          <w:sz w:val="20"/>
-        </w:rPr>
-        <w:t>us\</w:t>
-      </w:r>
-      <w:proofErr w:type="spellStart"/>
-      <w:r>
-        <w:rPr>
-          <w:rFonts w:ascii="Consolas" w:hAnsi="Consolas"/>
-          <w:color w:val="E36C0A" w:themeColor="accent6" w:themeShade="BF"/>
-          <w:sz w:val="20"/>
-        </w:rPr>
-        <w:t>EBS.IES.LOBLeads</w:t>
-      </w:r>
-      <w:proofErr w:type="spellEnd"/>
-    </w:p>
-    <w:p>
-      <w:pPr>
-        <w:pStyle w:val="ListParagraph"/>
-        <w:numPr>
-          <w:ilvl w:val="2"/>
-          <w:numId w:val="2"/>
-        </w:numPr>
-      </w:pPr>
-      <w:proofErr w:type="spellStart"/>
-      <w:r>
-        <w:t>CoverSheetApprovers</w:t>
-      </w:r>
-      <w:proofErr w:type="spellEnd"/>
-    </w:p>
-    <w:p>
-      <w:pPr>
-        <w:pStyle w:val="ListParagraph"/>
-        <w:numPr>
-          <w:ilvl w:val="3"/>
-          <w:numId w:val="2"/>
-        </w:numPr>
-      </w:pPr>
-      <w:r>
-        <w:t xml:space="preserve">Our value: </w:t>
-      </w:r>
-      <w:r>
-        <w:rPr>
-          <w:rFonts w:ascii="Consolas" w:hAnsi="Consolas"/>
-          <w:color w:val="E36C0A" w:themeColor="accent6" w:themeShade="BF"/>
-          <w:sz w:val="20"/>
-        </w:rPr>
-        <w:t>us\</w:t>
-      </w:r>
-      <w:proofErr w:type="spellStart"/>
-      <w:r>
-        <w:rPr>
-          <w:rFonts w:ascii="Consolas" w:hAnsi="Consolas"/>
-          <w:color w:val="E36C0A" w:themeColor="accent6" w:themeShade="BF"/>
-          <w:sz w:val="20"/>
-        </w:rPr>
-        <w:t>EBS.IES.CoverSheetApprovers</w:t>
-      </w:r>
-      <w:proofErr w:type="spellEnd"/>
+        <w:t>us\EBS.IES.CoverSheetApprovers</w:t>
+      </w:r>
     </w:p>
     <w:p>
       <w:pPr>
@@ -2827,11 +2767,9 @@
           <w:numId w:val="1"/>
         </w:numPr>
       </w:pPr>
-      <w:proofErr w:type="spellStart"/>
       <w:r>
         <w:t>IES.Web</w:t>
       </w:r>
-      <w:proofErr w:type="spellEnd"/>
     </w:p>
     <w:p>
       <w:pPr>
@@ -2841,11 +2779,9 @@
           <w:numId w:val="1"/>
         </w:numPr>
       </w:pPr>
-      <w:proofErr w:type="spellStart"/>
       <w:r>
         <w:t>PTM.Web</w:t>
       </w:r>
-      <w:proofErr w:type="spellEnd"/>
     </w:p>
     <w:p>
       <w:pPr>
@@ -2855,11 +2791,9 @@
           <w:numId w:val="1"/>
         </w:numPr>
       </w:pPr>
-      <w:proofErr w:type="spellStart"/>
       <w:r>
         <w:t>RDM.Web</w:t>
       </w:r>
-      <w:proofErr w:type="spellEnd"/>
     </w:p>
     <w:p>
       <w:pPr>
@@ -2869,11 +2803,9 @@
           <w:numId w:val="1"/>
         </w:numPr>
       </w:pPr>
-      <w:proofErr w:type="spellStart"/>
       <w:r>
         <w:t>RDSB.Web</w:t>
       </w:r>
-      <w:proofErr w:type="spellEnd"/>
     </w:p>
     <w:p>
       <w:pPr>
@@ -3258,7 +3190,6 @@
       <w:r>
         <w:t xml:space="preserve">The </w:t>
       </w:r>
-      <w:proofErr w:type="spellStart"/>
       <w:r>
         <w:rPr>
           <w:rFonts w:ascii="Consolas" w:hAnsi="Consolas"/>
@@ -3267,7 +3198,6 @@
         </w:rPr>
         <w:t>GenTracEmailScheduler.exe.config</w:t>
       </w:r>
-      <w:proofErr w:type="spellEnd"/>
       <w:r>
         <w:t xml:space="preserve"> file</w:t>
       </w:r>
@@ -3327,16 +3257,8 @@
         <w:rPr>
           <w:rFonts w:ascii="Calibri" w:eastAsia="Times New Roman" w:hAnsi="Calibri" w:cs="Calibri"/>
         </w:rPr>
-        <w:t xml:space="preserve"> PTM / </w:t>
-      </w:r>
-      <w:proofErr w:type="spellStart"/>
-      <w:r>
-        <w:rPr>
-          <w:rFonts w:ascii="Calibri" w:eastAsia="Times New Roman" w:hAnsi="Calibri" w:cs="Calibri"/>
-        </w:rPr>
-        <w:t>GenTrac</w:t>
-      </w:r>
-      <w:proofErr w:type="spellEnd"/>
+        <w:t xml:space="preserve"> PTM / GenTrac</w:t>
+      </w:r>
       <w:r>
         <w:rPr>
           <w:rFonts w:ascii="Calibri" w:eastAsia="Times New Roman" w:hAnsi="Calibri" w:cs="Calibri"/>
@@ -3478,7 +3400,6 @@
       <w:r>
         <w:t xml:space="preserve">The </w:t>
       </w:r>
-      <w:proofErr w:type="spellStart"/>
       <w:r>
         <w:rPr>
           <w:rFonts w:ascii="Consolas" w:eastAsia="Times New Roman" w:hAnsi="Consolas" w:cs="Calibri"/>
@@ -3488,11 +3409,7 @@
         <w:t>RDMClassifiedDeployment</w:t>
       </w:r>
       <w:r>
-        <w:t>.exe.config</w:t>
-      </w:r>
-      <w:proofErr w:type="spellEnd"/>
-      <w:r>
-        <w:t xml:space="preserve"> file</w:t>
+        <w:t>.exe.config file</w:t>
       </w:r>
     </w:p>
     <w:p>
@@ -3708,7 +3625,6 @@
       <w:r>
         <w:t xml:space="preserve">The </w:t>
       </w:r>
-      <w:proofErr w:type="spellStart"/>
       <w:r>
         <w:rPr>
           <w:rFonts w:ascii="Consolas" w:eastAsia="Times New Roman" w:hAnsi="Consolas" w:cs="Calibri"/>
@@ -3718,11 +3634,7 @@
         <w:t>GenBOEAutoBackup</w:t>
       </w:r>
       <w:r>
-        <w:t>.exe.config</w:t>
-      </w:r>
-      <w:proofErr w:type="spellEnd"/>
-      <w:r>
-        <w:t xml:space="preserve"> file</w:t>
+        <w:t>.exe.config file</w:t>
       </w:r>
     </w:p>
     <w:p>
@@ -3856,7 +3768,6 @@
         </w:rPr>
         <w:t xml:space="preserve">We use </w:t>
       </w:r>
-      <w:proofErr w:type="spellStart"/>
       <w:r>
         <w:rPr>
           <w:rFonts w:ascii="Consolas" w:eastAsia="Times New Roman" w:hAnsi="Consolas" w:cs="Calibri"/>
@@ -3864,7 +3775,6 @@
         </w:rPr>
         <w:t>GenTrac</w:t>
       </w:r>
-      <w:proofErr w:type="spellEnd"/>
       <w:r>
         <w:rPr>
           <w:rFonts w:ascii="Calibri" w:eastAsia="Times New Roman" w:hAnsi="Calibri" w:cs="Calibri"/>
@@ -3944,7 +3854,6 @@
       <w:r>
         <w:t>“</w:t>
       </w:r>
-      <w:proofErr w:type="spellStart"/>
       <w:r>
         <w:rPr>
           <w:rFonts w:ascii="Consolas" w:hAnsi="Consolas"/>
@@ -3952,7 +3861,6 @@
         </w:rPr>
         <w:t>genTrac</w:t>
       </w:r>
-      <w:proofErr w:type="spellEnd"/>
       <w:r>
         <w:t xml:space="preserve">”, </w:t>
       </w:r>
@@ -4321,15 +4229,7 @@
         <w:t>Appendix B</w:t>
       </w:r>
       <w:r>
-        <w:t xml:space="preserve">: IES </w:t>
-      </w:r>
-      <w:proofErr w:type="spellStart"/>
-      <w:r>
-        <w:t>Web.Config</w:t>
-      </w:r>
-      <w:proofErr w:type="spellEnd"/>
-      <w:r>
-        <w:t xml:space="preserve"> Customization</w:t>
+        <w:t>: IES Web.Config Customization</w:t>
       </w:r>
       <w:bookmarkEnd w:id="33"/>
     </w:p>
@@ -4368,25 +4268,14 @@
         </w:numPr>
         <w:spacing w:after="0"/>
       </w:pPr>
-      <w:proofErr w:type="spellStart"/>
-      <w:r>
-        <w:rPr>
-          <w:rFonts w:ascii="Consolas" w:eastAsiaTheme="minorHAnsi" w:hAnsi="Consolas" w:cs="Consolas"/>
-          <w:color w:val="0000FF"/>
-          <w:sz w:val="19"/>
-          <w:szCs w:val="19"/>
-        </w:rPr>
-        <w:t>IESEntities</w:t>
-      </w:r>
-      <w:proofErr w:type="spellEnd"/>
-      <w:r>
-        <w:rPr>
-          <w:rFonts w:ascii="Consolas" w:eastAsiaTheme="minorHAnsi" w:hAnsi="Consolas" w:cs="Consolas"/>
-          <w:color w:val="0000FF"/>
-          <w:sz w:val="19"/>
-          <w:szCs w:val="19"/>
-        </w:rPr>
-        <w:t xml:space="preserve"> </w:t>
+      <w:r>
+        <w:rPr>
+          <w:rFonts w:ascii="Consolas" w:eastAsiaTheme="minorHAnsi" w:hAnsi="Consolas" w:cs="Consolas"/>
+          <w:color w:val="0000FF"/>
+          <w:sz w:val="19"/>
+          <w:szCs w:val="19"/>
+        </w:rPr>
+        <w:t xml:space="preserve">IESEntities </w:t>
       </w:r>
       <w:r>
         <w:rPr>
@@ -4472,39 +4361,23 @@
           <w:rFonts w:ascii="Calibri" w:eastAsia="Times New Roman" w:hAnsi="Calibri" w:cs="Calibri"/>
         </w:rPr>
       </w:pPr>
-      <w:proofErr w:type="spellStart"/>
-      <w:r>
-        <w:rPr>
-          <w:rFonts w:ascii="Consolas" w:eastAsiaTheme="minorHAnsi" w:hAnsi="Consolas" w:cs="Consolas"/>
-          <w:color w:val="0000FF"/>
-          <w:sz w:val="19"/>
-          <w:szCs w:val="19"/>
-        </w:rPr>
-        <w:t>BOEUrl</w:t>
-      </w:r>
-      <w:proofErr w:type="spellEnd"/>
-      <w:r>
-        <w:rPr>
-          <w:rFonts w:ascii="Consolas" w:eastAsiaTheme="minorHAnsi" w:hAnsi="Consolas" w:cs="Consolas"/>
-          <w:color w:val="0000FF"/>
-          <w:sz w:val="19"/>
-          <w:szCs w:val="19"/>
-        </w:rPr>
-        <w:t xml:space="preserve"> </w:t>
+      <w:r>
+        <w:rPr>
+          <w:rFonts w:ascii="Consolas" w:eastAsiaTheme="minorHAnsi" w:hAnsi="Consolas" w:cs="Consolas"/>
+          <w:color w:val="0000FF"/>
+          <w:sz w:val="19"/>
+          <w:szCs w:val="19"/>
+        </w:rPr>
+        <w:t xml:space="preserve">BOEUrl </w:t>
       </w:r>
       <w:r>
         <w:t xml:space="preserve">– </w:t>
       </w:r>
-      <w:proofErr w:type="spellStart"/>
       <w:r>
         <w:t>GenBOE</w:t>
       </w:r>
       <w:r>
-        <w:t>’s</w:t>
-      </w:r>
-      <w:proofErr w:type="spellEnd"/>
-      <w:r>
-        <w:t xml:space="preserve"> URL</w:t>
+        <w:t>’s URL</w:t>
       </w:r>
     </w:p>
     <w:p>
@@ -4520,25 +4393,14 @@
           <w:rFonts w:ascii="Calibri" w:eastAsia="Times New Roman" w:hAnsi="Calibri" w:cs="Calibri"/>
         </w:rPr>
       </w:pPr>
-      <w:proofErr w:type="spellStart"/>
-      <w:r>
-        <w:rPr>
-          <w:rFonts w:ascii="Consolas" w:eastAsiaTheme="minorHAnsi" w:hAnsi="Consolas" w:cs="Consolas"/>
-          <w:color w:val="0000FF"/>
-          <w:sz w:val="19"/>
-          <w:szCs w:val="19"/>
-        </w:rPr>
-        <w:t>PTMUrl</w:t>
-      </w:r>
-      <w:proofErr w:type="spellEnd"/>
-      <w:r>
-        <w:rPr>
-          <w:rFonts w:ascii="Consolas" w:eastAsiaTheme="minorHAnsi" w:hAnsi="Consolas" w:cs="Consolas"/>
-          <w:color w:val="0000FF"/>
-          <w:sz w:val="19"/>
-          <w:szCs w:val="19"/>
-        </w:rPr>
-        <w:t xml:space="preserve"> </w:t>
+      <w:r>
+        <w:rPr>
+          <w:rFonts w:ascii="Consolas" w:eastAsiaTheme="minorHAnsi" w:hAnsi="Consolas" w:cs="Consolas"/>
+          <w:color w:val="0000FF"/>
+          <w:sz w:val="19"/>
+          <w:szCs w:val="19"/>
+        </w:rPr>
+        <w:t xml:space="preserve">PTMUrl </w:t>
       </w:r>
       <w:r>
         <w:t>– PTM’s URL</w:t>
@@ -4557,25 +4419,14 @@
           <w:rFonts w:ascii="Calibri" w:eastAsia="Times New Roman" w:hAnsi="Calibri" w:cs="Calibri"/>
         </w:rPr>
       </w:pPr>
-      <w:proofErr w:type="spellStart"/>
-      <w:r>
-        <w:rPr>
-          <w:rFonts w:ascii="Consolas" w:eastAsiaTheme="minorHAnsi" w:hAnsi="Consolas" w:cs="Consolas"/>
-          <w:color w:val="0000FF"/>
-          <w:sz w:val="19"/>
-          <w:szCs w:val="19"/>
-        </w:rPr>
-        <w:t>RDMUrl</w:t>
-      </w:r>
-      <w:proofErr w:type="spellEnd"/>
-      <w:r>
-        <w:rPr>
-          <w:rFonts w:ascii="Consolas" w:eastAsiaTheme="minorHAnsi" w:hAnsi="Consolas" w:cs="Consolas"/>
-          <w:color w:val="0000FF"/>
-          <w:sz w:val="19"/>
-          <w:szCs w:val="19"/>
-        </w:rPr>
-        <w:t xml:space="preserve"> </w:t>
+      <w:r>
+        <w:rPr>
+          <w:rFonts w:ascii="Consolas" w:eastAsiaTheme="minorHAnsi" w:hAnsi="Consolas" w:cs="Consolas"/>
+          <w:color w:val="0000FF"/>
+          <w:sz w:val="19"/>
+          <w:szCs w:val="19"/>
+        </w:rPr>
+        <w:t xml:space="preserve">RDMUrl </w:t>
       </w:r>
       <w:r>
         <w:t>– RDM’s URL</w:t>
@@ -4594,52 +4445,17 @@
           <w:rFonts w:ascii="Calibri" w:eastAsia="Times New Roman" w:hAnsi="Calibri" w:cs="Calibri"/>
         </w:rPr>
       </w:pPr>
-      <w:proofErr w:type="spellStart"/>
-      <w:r>
-        <w:rPr>
-          <w:rFonts w:ascii="Consolas" w:eastAsiaTheme="minorHAnsi" w:hAnsi="Consolas" w:cs="Consolas"/>
-          <w:color w:val="0000FF"/>
-          <w:sz w:val="19"/>
-          <w:szCs w:val="19"/>
-        </w:rPr>
-        <w:t>PPUrl</w:t>
-      </w:r>
-      <w:proofErr w:type="spellEnd"/>
-      <w:r>
-        <w:rPr>
-          <w:rFonts w:ascii="Consolas" w:eastAsiaTheme="minorHAnsi" w:hAnsi="Consolas" w:cs="Consolas"/>
-          <w:color w:val="0000FF"/>
-          <w:sz w:val="19"/>
-          <w:szCs w:val="19"/>
-        </w:rPr>
-        <w:t xml:space="preserve"> </w:t>
-      </w:r>
-      <w:r>
-        <w:t xml:space="preserve">– </w:t>
-      </w:r>
-      <w:proofErr w:type="spellStart"/>
-      <w:r>
-        <w:t>ProPricer</w:t>
-      </w:r>
-      <w:proofErr w:type="spellEnd"/>
-      <w:r>
-        <w:t xml:space="preserve"> URL – a URL to a </w:t>
-      </w:r>
-      <w:proofErr w:type="spellStart"/>
-      <w:r>
-        <w:t>sharepoint</w:t>
-      </w:r>
-      <w:proofErr w:type="spellEnd"/>
-      <w:r>
-        <w:t xml:space="preserve"> site where </w:t>
-      </w:r>
-      <w:proofErr w:type="spellStart"/>
-      <w:r>
-        <w:t>ProPricer</w:t>
-      </w:r>
-      <w:proofErr w:type="spellEnd"/>
-      <w:r>
-        <w:t xml:space="preserve"> links are located</w:t>
+      <w:r>
+        <w:rPr>
+          <w:rFonts w:ascii="Consolas" w:eastAsiaTheme="minorHAnsi" w:hAnsi="Consolas" w:cs="Consolas"/>
+          <w:color w:val="0000FF"/>
+          <w:sz w:val="19"/>
+          <w:szCs w:val="19"/>
+        </w:rPr>
+        <w:t xml:space="preserve">PPUrl </w:t>
+      </w:r>
+      <w:r>
+        <w:t>– ProPricer URL – a URL to a sharepoint site where ProPricer links are located</w:t>
       </w:r>
     </w:p>
     <w:p>
@@ -4655,25 +4471,14 @@
           <w:rFonts w:ascii="Calibri" w:eastAsia="Times New Roman" w:hAnsi="Calibri" w:cs="Calibri"/>
         </w:rPr>
       </w:pPr>
-      <w:proofErr w:type="spellStart"/>
-      <w:r>
-        <w:rPr>
-          <w:rFonts w:ascii="Consolas" w:eastAsiaTheme="minorHAnsi" w:hAnsi="Consolas" w:cs="Consolas"/>
-          <w:color w:val="0000FF"/>
-          <w:sz w:val="19"/>
-          <w:szCs w:val="19"/>
-        </w:rPr>
-        <w:t>RPMUrl</w:t>
-      </w:r>
-      <w:proofErr w:type="spellEnd"/>
-      <w:r>
-        <w:rPr>
-          <w:rFonts w:ascii="Consolas" w:eastAsiaTheme="minorHAnsi" w:hAnsi="Consolas" w:cs="Consolas"/>
-          <w:color w:val="0000FF"/>
-          <w:sz w:val="19"/>
-          <w:szCs w:val="19"/>
-        </w:rPr>
-        <w:t xml:space="preserve"> </w:t>
+      <w:r>
+        <w:rPr>
+          <w:rFonts w:ascii="Consolas" w:eastAsiaTheme="minorHAnsi" w:hAnsi="Consolas" w:cs="Consolas"/>
+          <w:color w:val="0000FF"/>
+          <w:sz w:val="19"/>
+          <w:szCs w:val="19"/>
+        </w:rPr>
+        <w:t xml:space="preserve">RPMUrl </w:t>
       </w:r>
       <w:r>
         <w:t xml:space="preserve">– </w:t>
@@ -4709,25 +4514,14 @@
           <w:rFonts w:ascii="Calibri" w:eastAsia="Times New Roman" w:hAnsi="Calibri" w:cs="Calibri"/>
         </w:rPr>
       </w:pPr>
-      <w:proofErr w:type="spellStart"/>
-      <w:r>
-        <w:rPr>
-          <w:rFonts w:ascii="Consolas" w:eastAsiaTheme="minorHAnsi" w:hAnsi="Consolas" w:cs="Consolas"/>
-          <w:color w:val="0000FF"/>
-          <w:sz w:val="19"/>
-          <w:szCs w:val="19"/>
-        </w:rPr>
-        <w:t>IESPortalAdminGroups</w:t>
-      </w:r>
-      <w:proofErr w:type="spellEnd"/>
-      <w:r>
-        <w:rPr>
-          <w:rFonts w:ascii="Consolas" w:eastAsiaTheme="minorHAnsi" w:hAnsi="Consolas" w:cs="Consolas"/>
-          <w:color w:val="0000FF"/>
-          <w:sz w:val="19"/>
-          <w:szCs w:val="19"/>
-        </w:rPr>
-        <w:t xml:space="preserve"> </w:t>
+      <w:r>
+        <w:rPr>
+          <w:rFonts w:ascii="Consolas" w:eastAsiaTheme="minorHAnsi" w:hAnsi="Consolas" w:cs="Consolas"/>
+          <w:color w:val="0000FF"/>
+          <w:sz w:val="19"/>
+          <w:szCs w:val="19"/>
+        </w:rPr>
+        <w:t xml:space="preserve">IESPortalAdminGroups </w:t>
       </w:r>
       <w:r>
         <w:t>– Admin AD group</w:t>
@@ -4837,7 +4631,6 @@
           <w:rFonts w:ascii="Calibri" w:eastAsia="Times New Roman" w:hAnsi="Calibri" w:cs="Calibri"/>
         </w:rPr>
       </w:pPr>
-      <w:proofErr w:type="spellStart"/>
       <w:r>
         <w:rPr>
           <w:rFonts w:ascii="Consolas" w:eastAsiaTheme="minorHAnsi" w:hAnsi="Consolas" w:cs="Consolas"/>
@@ -4848,7 +4641,6 @@
         </w:rPr>
         <w:t>system.web</w:t>
       </w:r>
-      <w:proofErr w:type="spellEnd"/>
       <w:r>
         <w:rPr>
           <w:rFonts w:ascii="Consolas" w:eastAsiaTheme="minorHAnsi" w:hAnsi="Consolas" w:cs="Consolas"/>
@@ -5031,7 +4823,6 @@
         </w:rPr>
         <w:t>"</w:t>
       </w:r>
-      <w:proofErr w:type="spellStart"/>
       <w:r>
         <w:rPr>
           <w:rFonts w:ascii="Consolas" w:eastAsiaTheme="minorHAnsi" w:hAnsi="Consolas" w:cs="Consolas"/>
@@ -5042,7 +4833,6 @@
         </w:rPr>
         <w:t>elmah.axd</w:t>
       </w:r>
-      <w:proofErr w:type="spellEnd"/>
       <w:r>
         <w:rPr>
           <w:rFonts w:ascii="Consolas" w:eastAsiaTheme="minorHAnsi" w:hAnsi="Consolas" w:cs="Consolas"/>
@@ -5069,7 +4859,6 @@
         </w:rPr>
         <w:t xml:space="preserve">-&gt; </w:t>
       </w:r>
-      <w:proofErr w:type="spellStart"/>
       <w:r>
         <w:rPr>
           <w:rFonts w:ascii="Consolas" w:eastAsiaTheme="minorHAnsi" w:hAnsi="Consolas" w:cs="Consolas"/>
@@ -5080,7 +4869,6 @@
         </w:rPr>
         <w:t>system.web</w:t>
       </w:r>
-      <w:proofErr w:type="spellEnd"/>
       <w:r>
         <w:rPr>
           <w:rFonts w:ascii="Consolas" w:eastAsiaTheme="minorHAnsi" w:hAnsi="Consolas" w:cs="Consolas"/>
@@ -5365,7 +5153,6 @@
         </w:rPr>
         <w:t xml:space="preserve"> </w:t>
       </w:r>
-      <w:proofErr w:type="spellStart"/>
       <w:r>
         <w:rPr>
           <w:rFonts w:ascii="Consolas" w:eastAsiaTheme="minorHAnsi" w:hAnsi="Consolas" w:cs="Consolas"/>
@@ -5375,7 +5162,6 @@
         </w:rPr>
         <w:t>stopProcessing</w:t>
       </w:r>
-      <w:proofErr w:type="spellEnd"/>
       <w:r>
         <w:rPr>
           <w:rFonts w:ascii="Consolas" w:eastAsiaTheme="minorHAnsi" w:hAnsi="Consolas" w:cs="Consolas"/>
@@ -5433,7 +5219,6 @@
         </w:rPr>
         <w:t xml:space="preserve">          &lt;match </w:t>
       </w:r>
-      <w:proofErr w:type="spellStart"/>
       <w:r>
         <w:rPr>
           <w:rFonts w:ascii="Consolas" w:eastAsiaTheme="minorHAnsi" w:hAnsi="Consolas" w:cs="Consolas"/>
@@ -5443,7 +5228,6 @@
         </w:rPr>
         <w:t>url</w:t>
       </w:r>
-      <w:proofErr w:type="spellEnd"/>
       <w:r>
         <w:rPr>
           <w:rFonts w:ascii="Consolas" w:eastAsiaTheme="minorHAnsi" w:hAnsi="Consolas" w:cs="Consolas"/>
@@ -5451,9 +5235,68 @@
           <w:sz w:val="19"/>
           <w:szCs w:val="19"/>
         </w:rPr>
-        <w:t>="</w:t>
-      </w:r>
-      <w:proofErr w:type="gramStart"/>
+        <w:t>="(.*)"</w:t>
+      </w:r>
+      <w:r>
+        <w:rPr>
+          <w:rFonts w:ascii="Consolas" w:eastAsiaTheme="minorHAnsi" w:hAnsi="Consolas" w:cs="Consolas"/>
+          <w:color w:val="0000FF"/>
+          <w:sz w:val="19"/>
+          <w:szCs w:val="19"/>
+        </w:rPr>
+        <w:t xml:space="preserve"> /&gt;</w:t>
+      </w:r>
+    </w:p>
+    <w:p>
+      <w:pPr>
+        <w:pStyle w:val="ListParagraph"/>
+        <w:spacing w:line="240" w:lineRule="auto"/>
+        <w:rPr>
+          <w:rFonts w:ascii="Consolas" w:eastAsiaTheme="minorHAnsi" w:hAnsi="Consolas" w:cs="Consolas"/>
+          <w:color w:val="0000FF"/>
+          <w:sz w:val="19"/>
+          <w:szCs w:val="19"/>
+        </w:rPr>
+      </w:pPr>
+      <w:r>
+        <w:rPr>
+          <w:rFonts w:ascii="Consolas" w:eastAsiaTheme="minorHAnsi" w:hAnsi="Consolas" w:cs="Consolas"/>
+          <w:color w:val="0000FF"/>
+          <w:sz w:val="19"/>
+          <w:szCs w:val="19"/>
+        </w:rPr>
+        <w:t xml:space="preserve">          &lt;conditions&gt;</w:t>
+      </w:r>
+    </w:p>
+    <w:p>
+      <w:pPr>
+        <w:pStyle w:val="ListParagraph"/>
+        <w:spacing w:line="240" w:lineRule="auto"/>
+        <w:rPr>
+          <w:rFonts w:ascii="Consolas" w:eastAsiaTheme="minorHAnsi" w:hAnsi="Consolas" w:cs="Consolas"/>
+          <w:color w:val="0000FF"/>
+          <w:sz w:val="19"/>
+          <w:szCs w:val="19"/>
+        </w:rPr>
+      </w:pPr>
+      <w:r>
+        <w:rPr>
+          <w:rFonts w:ascii="Consolas" w:eastAsiaTheme="minorHAnsi" w:hAnsi="Consolas" w:cs="Consolas"/>
+          <w:color w:val="0000FF"/>
+          <w:sz w:val="19"/>
+          <w:szCs w:val="19"/>
+        </w:rPr>
+        <w:t xml:space="preserve">            &lt;add </w:t>
+      </w:r>
+      <w:r>
+        <w:rPr>
+          <w:rFonts w:ascii="Consolas" w:eastAsiaTheme="minorHAnsi" w:hAnsi="Consolas" w:cs="Consolas"/>
+          <w:color w:val="FF0000"/>
+          <w:sz w:val="19"/>
+          <w:szCs w:val="19"/>
+        </w:rPr>
+        <w:t>input</w:t>
+      </w:r>
       <w:r>
         <w:rPr>
           <w:rFonts w:ascii="Consolas" w:eastAsiaTheme="minorHAnsi" w:hAnsi="Consolas" w:cs="Consolas"/>
@@ -5461,9 +5304,26 @@
           <w:sz w:val="19"/>
           <w:szCs w:val="19"/>
         </w:rPr>
-        <w:t>(.*</w:t>
-      </w:r>
-      <w:proofErr w:type="gramEnd"/>
+        <w:t>="{HTTPS}"</w:t>
+      </w:r>
+      <w:r>
+        <w:rPr>
+          <w:rFonts w:ascii="Consolas" w:eastAsiaTheme="minorHAnsi" w:hAnsi="Consolas" w:cs="Consolas"/>
+          <w:color w:val="0000FF"/>
+          <w:sz w:val="19"/>
+          <w:szCs w:val="19"/>
+        </w:rPr>
+        <w:t xml:space="preserve"> </w:t>
+      </w:r>
+      <w:r>
+        <w:rPr>
+          <w:rFonts w:ascii="Consolas" w:eastAsiaTheme="minorHAnsi" w:hAnsi="Consolas" w:cs="Consolas"/>
+          <w:color w:val="FF0000"/>
+          <w:sz w:val="19"/>
+          <w:szCs w:val="19"/>
+        </w:rPr>
+        <w:t>pattern</w:t>
+      </w:r>
       <w:r>
         <w:rPr>
           <w:rFonts w:ascii="Consolas" w:eastAsiaTheme="minorHAnsi" w:hAnsi="Consolas" w:cs="Consolas"/>
@@ -5471,7 +5331,7 @@
           <w:sz w:val="19"/>
           <w:szCs w:val="19"/>
         </w:rPr>
-        <w:t>)"</w:t>
+        <w:t>="^OFF$"</w:t>
       </w:r>
       <w:r>
         <w:rPr>
@@ -5501,7 +5361,7 @@
           <w:sz w:val="19"/>
           <w:szCs w:val="19"/>
         </w:rPr>
-        <w:t xml:space="preserve">          &lt;conditions&gt;</w:t>
+        <w:t xml:space="preserve">          &lt;/conditions&gt;</w:t>
       </w:r>
     </w:p>
     <w:p>
@@ -5522,7 +5382,7 @@
           <w:sz w:val="19"/>
           <w:szCs w:val="19"/>
         </w:rPr>
-        <w:t xml:space="preserve">            &lt;add </w:t>
+        <w:t xml:space="preserve">          &lt;action </w:t>
       </w:r>
       <w:r>
         <w:rPr>
@@ -5531,7 +5391,7 @@
           <w:sz w:val="19"/>
           <w:szCs w:val="19"/>
         </w:rPr>
-        <w:t>input</w:t>
+        <w:t>type</w:t>
       </w:r>
       <w:r>
         <w:rPr>
@@ -5540,16 +5400,7 @@
           <w:sz w:val="19"/>
           <w:szCs w:val="19"/>
         </w:rPr>
-        <w:t>="{HTTPS}"</w:t>
-      </w:r>
-      <w:r>
-        <w:rPr>
-          <w:rFonts w:ascii="Consolas" w:eastAsiaTheme="minorHAnsi" w:hAnsi="Consolas" w:cs="Consolas"/>
-          <w:color w:val="0000FF"/>
-          <w:sz w:val="19"/>
-          <w:szCs w:val="19"/>
-        </w:rPr>
-        <w:t xml:space="preserve"> </w:t>
+        <w:t xml:space="preserve">="Redirect" </w:t>
       </w:r>
       <w:r>
         <w:rPr>
@@ -5558,7 +5409,7 @@
           <w:sz w:val="19"/>
           <w:szCs w:val="19"/>
         </w:rPr>
-        <w:t>pattern</w:t>
+        <w:t>url</w:t>
       </w:r>
       <w:r>
         <w:rPr>
@@ -5567,7 +5418,7 @@
           <w:sz w:val="19"/>
           <w:szCs w:val="19"/>
         </w:rPr>
-        <w:t>="^OFF$"</w:t>
+        <w:t>="https://{HTTP_HOST}/{R:1}"</w:t>
       </w:r>
       <w:r>
         <w:rPr>
@@ -5597,7 +5448,7 @@
           <w:sz w:val="19"/>
           <w:szCs w:val="19"/>
         </w:rPr>
-        <w:t xml:space="preserve">          &lt;/conditions&gt;</w:t>
+        <w:t xml:space="preserve">        &lt;/rule&gt;</w:t>
       </w:r>
     </w:p>
     <w:p>
@@ -5618,102 +5469,13 @@
           <w:sz w:val="19"/>
           <w:szCs w:val="19"/>
         </w:rPr>
-        <w:t xml:space="preserve">          &lt;action </w:t>
-      </w:r>
-      <w:r>
-        <w:rPr>
-          <w:rFonts w:ascii="Consolas" w:eastAsiaTheme="minorHAnsi" w:hAnsi="Consolas" w:cs="Consolas"/>
-          <w:color w:val="FF0000"/>
-          <w:sz w:val="19"/>
-          <w:szCs w:val="19"/>
-        </w:rPr>
-        <w:t>type</w:t>
-      </w:r>
-      <w:r>
-        <w:rPr>
-          <w:rFonts w:ascii="Consolas" w:eastAsiaTheme="minorHAnsi" w:hAnsi="Consolas" w:cs="Consolas"/>
-          <w:color w:val="8064A2" w:themeColor="accent4"/>
-          <w:sz w:val="19"/>
-          <w:szCs w:val="19"/>
-        </w:rPr>
-        <w:t xml:space="preserve">="Redirect" </w:t>
-      </w:r>
-      <w:proofErr w:type="spellStart"/>
-      <w:r>
-        <w:rPr>
-          <w:rFonts w:ascii="Consolas" w:eastAsiaTheme="minorHAnsi" w:hAnsi="Consolas" w:cs="Consolas"/>
-          <w:color w:val="FF0000"/>
-          <w:sz w:val="19"/>
-          <w:szCs w:val="19"/>
-        </w:rPr>
-        <w:t>url</w:t>
-      </w:r>
-      <w:proofErr w:type="spellEnd"/>
-      <w:r>
-        <w:rPr>
-          <w:rFonts w:ascii="Consolas" w:eastAsiaTheme="minorHAnsi" w:hAnsi="Consolas" w:cs="Consolas"/>
-          <w:color w:val="8064A2" w:themeColor="accent4"/>
-          <w:sz w:val="19"/>
-          <w:szCs w:val="19"/>
-        </w:rPr>
-        <w:t>="https://{HTTP_HOST}/{R:1}"</w:t>
-      </w:r>
-      <w:r>
-        <w:rPr>
-          <w:rFonts w:ascii="Consolas" w:eastAsiaTheme="minorHAnsi" w:hAnsi="Consolas" w:cs="Consolas"/>
-          <w:color w:val="0000FF"/>
-          <w:sz w:val="19"/>
-          <w:szCs w:val="19"/>
-        </w:rPr>
-        <w:t xml:space="preserve"> /&gt;</w:t>
+        <w:t xml:space="preserve">      &lt;/rules&gt;</w:t>
       </w:r>
     </w:p>
     <w:p>
       <w:pPr>
         <w:pStyle w:val="ListParagraph"/>
         <w:spacing w:line="240" w:lineRule="auto"/>
-        <w:rPr>
-          <w:rFonts w:ascii="Consolas" w:eastAsiaTheme="minorHAnsi" w:hAnsi="Consolas" w:cs="Consolas"/>
-          <w:color w:val="0000FF"/>
-          <w:sz w:val="19"/>
-          <w:szCs w:val="19"/>
-        </w:rPr>
-      </w:pPr>
-      <w:r>
-        <w:rPr>
-          <w:rFonts w:ascii="Consolas" w:eastAsiaTheme="minorHAnsi" w:hAnsi="Consolas" w:cs="Consolas"/>
-          <w:color w:val="0000FF"/>
-          <w:sz w:val="19"/>
-          <w:szCs w:val="19"/>
-        </w:rPr>
-        <w:t xml:space="preserve">        &lt;/rule&gt;</w:t>
-      </w:r>
-    </w:p>
-    <w:p>
-      <w:pPr>
-        <w:pStyle w:val="ListParagraph"/>
-        <w:spacing w:line="240" w:lineRule="auto"/>
-        <w:rPr>
-          <w:rFonts w:ascii="Consolas" w:eastAsiaTheme="minorHAnsi" w:hAnsi="Consolas" w:cs="Consolas"/>
-          <w:color w:val="0000FF"/>
-          <w:sz w:val="19"/>
-          <w:szCs w:val="19"/>
-        </w:rPr>
-      </w:pPr>
-      <w:r>
-        <w:rPr>
-          <w:rFonts w:ascii="Consolas" w:eastAsiaTheme="minorHAnsi" w:hAnsi="Consolas" w:cs="Consolas"/>
-          <w:color w:val="0000FF"/>
-          <w:sz w:val="19"/>
-          <w:szCs w:val="19"/>
-        </w:rPr>
-        <w:t xml:space="preserve">      &lt;/rules&gt;</w:t>
-      </w:r>
-    </w:p>
-    <w:p>
-      <w:pPr>
-        <w:pStyle w:val="ListParagraph"/>
-        <w:spacing w:line="240" w:lineRule="auto"/>
       </w:pPr>
       <w:r>
         <w:rPr>
@@ -5739,13 +5501,8 @@
       <w:r>
         <w:t xml:space="preserve">PTM </w:t>
       </w:r>
-      <w:proofErr w:type="spellStart"/>
-      <w:r>
-        <w:t>Web.Config</w:t>
-      </w:r>
-      <w:proofErr w:type="spellEnd"/>
-      <w:r>
-        <w:t xml:space="preserve"> Customization</w:t>
+      <w:r>
+        <w:t>Web.Config Customization</w:t>
       </w:r>
       <w:bookmarkEnd w:id="34"/>
       <w:bookmarkEnd w:id="35"/>
@@ -5785,25 +5542,14 @@
         </w:numPr>
         <w:spacing w:after="0"/>
       </w:pPr>
-      <w:proofErr w:type="spellStart"/>
-      <w:r>
-        <w:rPr>
-          <w:rFonts w:ascii="Consolas" w:eastAsiaTheme="minorHAnsi" w:hAnsi="Consolas" w:cs="Consolas"/>
-          <w:color w:val="0000FF"/>
-          <w:sz w:val="19"/>
-          <w:szCs w:val="19"/>
-        </w:rPr>
-        <w:t>genTracEntities</w:t>
-      </w:r>
-      <w:proofErr w:type="spellEnd"/>
-      <w:r>
-        <w:rPr>
-          <w:rFonts w:ascii="Consolas" w:eastAsiaTheme="minorHAnsi" w:hAnsi="Consolas" w:cs="Consolas"/>
-          <w:color w:val="0000FF"/>
-          <w:sz w:val="19"/>
-          <w:szCs w:val="19"/>
-        </w:rPr>
-        <w:t xml:space="preserve"> </w:t>
+      <w:r>
+        <w:rPr>
+          <w:rFonts w:ascii="Consolas" w:eastAsiaTheme="minorHAnsi" w:hAnsi="Consolas" w:cs="Consolas"/>
+          <w:color w:val="0000FF"/>
+          <w:sz w:val="19"/>
+          <w:szCs w:val="19"/>
+        </w:rPr>
+        <w:t xml:space="preserve">genTracEntities </w:t>
       </w:r>
       <w:r>
         <w:rPr>
@@ -5833,7 +5579,6 @@
         </w:numPr>
         <w:spacing w:after="0"/>
       </w:pPr>
-      <w:proofErr w:type="spellStart"/>
       <w:r>
         <w:rPr>
           <w:rFonts w:ascii="Consolas" w:eastAsiaTheme="minorHAnsi" w:hAnsi="Consolas" w:cs="Consolas"/>
@@ -5850,17 +5595,7 @@
           <w:sz w:val="19"/>
           <w:szCs w:val="19"/>
         </w:rPr>
-        <w:t>Entities</w:t>
-      </w:r>
-      <w:proofErr w:type="spellEnd"/>
-      <w:r>
-        <w:rPr>
-          <w:rFonts w:ascii="Consolas" w:eastAsiaTheme="minorHAnsi" w:hAnsi="Consolas" w:cs="Consolas"/>
-          <w:color w:val="0000FF"/>
-          <w:sz w:val="19"/>
-          <w:szCs w:val="19"/>
-        </w:rPr>
-        <w:t xml:space="preserve"> </w:t>
+        <w:t xml:space="preserve">Entities </w:t>
       </w:r>
       <w:r>
         <w:rPr>
@@ -5950,7 +5685,6 @@
           <w:rFonts w:ascii="Calibri" w:eastAsia="Times New Roman" w:hAnsi="Calibri" w:cs="Calibri"/>
         </w:rPr>
       </w:pPr>
-      <w:proofErr w:type="spellStart"/>
       <w:r>
         <w:rPr>
           <w:rFonts w:ascii="Consolas" w:eastAsiaTheme="minorHAnsi" w:hAnsi="Consolas" w:cs="Consolas"/>
@@ -5961,7 +5695,6 @@
         </w:rPr>
         <w:t>EmailServer</w:t>
       </w:r>
-      <w:proofErr w:type="spellEnd"/>
       <w:r>
         <w:t xml:space="preserve"> </w:t>
       </w:r>
@@ -5984,7 +5717,6 @@
           <w:rFonts w:ascii="Calibri" w:eastAsia="Times New Roman" w:hAnsi="Calibri" w:cs="Calibri"/>
         </w:rPr>
       </w:pPr>
-      <w:proofErr w:type="spellStart"/>
       <w:r>
         <w:rPr>
           <w:rFonts w:ascii="Consolas" w:eastAsiaTheme="minorHAnsi" w:hAnsi="Consolas" w:cs="Consolas"/>
@@ -5995,7 +5727,6 @@
         </w:rPr>
         <w:t>ActiveDirectoryPath</w:t>
       </w:r>
-      <w:proofErr w:type="spellEnd"/>
       <w:r>
         <w:t xml:space="preserve"> </w:t>
       </w:r>
@@ -6018,7 +5749,6 @@
           <w:rFonts w:ascii="Calibri" w:eastAsia="Times New Roman" w:hAnsi="Calibri" w:cs="Calibri"/>
         </w:rPr>
       </w:pPr>
-      <w:proofErr w:type="spellStart"/>
       <w:r>
         <w:rPr>
           <w:rFonts w:ascii="Consolas" w:eastAsiaTheme="minorHAnsi" w:hAnsi="Consolas" w:cs="Consolas"/>
@@ -6029,7 +5759,6 @@
         </w:rPr>
         <w:t>ServerURL</w:t>
       </w:r>
-      <w:proofErr w:type="spellEnd"/>
       <w:r>
         <w:rPr>
           <w:rFonts w:eastAsiaTheme="minorHAnsi" w:cs="Consolas"/>
@@ -6053,7 +5782,6 @@
           <w:rFonts w:ascii="Calibri" w:eastAsia="Times New Roman" w:hAnsi="Calibri" w:cs="Calibri"/>
         </w:rPr>
       </w:pPr>
-      <w:proofErr w:type="spellStart"/>
       <w:r>
         <w:rPr>
           <w:rFonts w:ascii="Consolas" w:eastAsiaTheme="minorHAnsi" w:hAnsi="Consolas" w:cs="Consolas"/>
@@ -6063,7 +5791,6 @@
         </w:rPr>
         <w:t>AuthorizeProposalCreationGroups</w:t>
       </w:r>
-      <w:proofErr w:type="spellEnd"/>
       <w:r>
         <w:rPr>
           <w:rFonts w:ascii="Calibri" w:eastAsia="Times New Roman" w:hAnsi="Calibri" w:cs="Calibri"/>
@@ -6083,19 +5810,8 @@
           <w:sz w:val="19"/>
           <w:szCs w:val="19"/>
         </w:rPr>
-        <w:t>US\</w:t>
-      </w:r>
-      <w:proofErr w:type="spellStart"/>
-      <w:r>
-        <w:rPr>
-          <w:rFonts w:ascii="Consolas" w:eastAsiaTheme="minorHAnsi" w:hAnsi="Consolas" w:cs="Consolas"/>
-          <w:color w:val="0000FF"/>
-          <w:sz w:val="19"/>
-          <w:szCs w:val="19"/>
-        </w:rPr>
-        <w:t>lmco.all.emp</w:t>
-      </w:r>
-      <w:proofErr w:type="spellEnd"/>
+        <w:t>US\lmco.all.emp</w:t>
+      </w:r>
     </w:p>
     <w:p>
       <w:pPr>
@@ -6109,7 +5825,6 @@
           <w:rFonts w:ascii="Calibri" w:eastAsia="Times New Roman" w:hAnsi="Calibri" w:cs="Calibri"/>
         </w:rPr>
       </w:pPr>
-      <w:proofErr w:type="spellStart"/>
       <w:r>
         <w:rPr>
           <w:rFonts w:ascii="Consolas" w:eastAsiaTheme="minorHAnsi" w:hAnsi="Consolas" w:cs="Consolas"/>
@@ -6120,7 +5835,6 @@
         </w:rPr>
         <w:t>DomesticUsersGroup</w:t>
       </w:r>
-      <w:proofErr w:type="spellEnd"/>
       <w:r>
         <w:rPr>
           <w:rFonts w:ascii="Calibri" w:eastAsia="Times New Roman" w:hAnsi="Calibri" w:cs="Calibri"/>
@@ -6164,19 +5878,8 @@
           <w:sz w:val="19"/>
           <w:szCs w:val="19"/>
         </w:rPr>
-        <w:t>US\</w:t>
-      </w:r>
-      <w:proofErr w:type="spellStart"/>
-      <w:r>
-        <w:rPr>
-          <w:rFonts w:ascii="Consolas" w:eastAsiaTheme="minorHAnsi" w:hAnsi="Consolas" w:cs="Consolas"/>
-          <w:color w:val="0000FF"/>
-          <w:sz w:val="19"/>
-          <w:szCs w:val="19"/>
-        </w:rPr>
-        <w:t>lmco.all.emp</w:t>
-      </w:r>
-      <w:proofErr w:type="spellEnd"/>
+        <w:t>US\lmco.all.emp</w:t>
+      </w:r>
     </w:p>
     <w:p>
       <w:pPr>
@@ -6187,7 +5890,6 @@
         </w:numPr>
         <w:spacing w:after="0"/>
       </w:pPr>
-      <w:proofErr w:type="spellStart"/>
       <w:r>
         <w:rPr>
           <w:rFonts w:ascii="Consolas" w:eastAsiaTheme="minorHAnsi" w:hAnsi="Consolas" w:cs="Consolas"/>
@@ -6198,7 +5900,6 @@
         </w:rPr>
         <w:t>HelpdeskEmailAddress</w:t>
       </w:r>
-      <w:proofErr w:type="spellEnd"/>
       <w:r>
         <w:t xml:space="preserve"> – email displayed to the users to contact for help</w:t>
       </w:r>
@@ -6216,7 +5917,6 @@
           <w:rFonts w:ascii="Calibri" w:eastAsia="Times New Roman" w:hAnsi="Calibri" w:cs="Calibri"/>
         </w:rPr>
       </w:pPr>
-      <w:proofErr w:type="spellStart"/>
       <w:r>
         <w:rPr>
           <w:rFonts w:ascii="Consolas" w:eastAsiaTheme="minorHAnsi" w:hAnsi="Consolas" w:cs="Consolas"/>
@@ -6226,7 +5926,6 @@
         </w:rPr>
         <w:t>BaseUrlForInstructionLocation</w:t>
       </w:r>
-      <w:proofErr w:type="spellEnd"/>
       <w:r>
         <w:t xml:space="preserve"> – set this to the URL where the instruction files can be located. This path should start with </w:t>
       </w:r>
@@ -6294,25 +5993,14 @@
           <w:rFonts w:ascii="Calibri" w:eastAsia="Times New Roman" w:hAnsi="Calibri" w:cs="Calibri"/>
         </w:rPr>
       </w:pPr>
-      <w:proofErr w:type="spellStart"/>
-      <w:r>
-        <w:rPr>
-          <w:rFonts w:ascii="Consolas" w:eastAsiaTheme="minorHAnsi" w:hAnsi="Consolas" w:cs="Consolas"/>
-          <w:color w:val="0000FF"/>
-          <w:sz w:val="19"/>
-          <w:szCs w:val="19"/>
-        </w:rPr>
-        <w:t>IsClassEnvironment</w:t>
-      </w:r>
-      <w:proofErr w:type="spellEnd"/>
-      <w:r>
-        <w:rPr>
-          <w:rFonts w:ascii="Consolas" w:eastAsiaTheme="minorHAnsi" w:hAnsi="Consolas" w:cs="Consolas"/>
-          <w:color w:val="0000FF"/>
-          <w:sz w:val="19"/>
-          <w:szCs w:val="19"/>
-        </w:rPr>
-        <w:t xml:space="preserve"> </w:t>
+      <w:r>
+        <w:rPr>
+          <w:rFonts w:ascii="Consolas" w:eastAsiaTheme="minorHAnsi" w:hAnsi="Consolas" w:cs="Consolas"/>
+          <w:color w:val="0000FF"/>
+          <w:sz w:val="19"/>
+          <w:szCs w:val="19"/>
+        </w:rPr>
+        <w:t xml:space="preserve">IsClassEnvironment </w:t>
       </w:r>
       <w:r>
         <w:t xml:space="preserve">– set this to </w:t>
@@ -6436,7 +6124,6 @@
           <w:rFonts w:ascii="Calibri" w:eastAsia="Times New Roman" w:hAnsi="Calibri" w:cs="Calibri"/>
         </w:rPr>
       </w:pPr>
-      <w:proofErr w:type="spellStart"/>
       <w:r>
         <w:rPr>
           <w:rFonts w:ascii="Consolas" w:eastAsiaTheme="minorHAnsi" w:hAnsi="Consolas" w:cs="Consolas"/>
@@ -6446,7 +6133,6 @@
         </w:rPr>
         <w:t>IESHeaderUrl</w:t>
       </w:r>
-      <w:proofErr w:type="spellEnd"/>
       <w:r>
         <w:t xml:space="preserve"> – if IES portal is installed, put in the URL to it; otherwise leave blank</w:t>
       </w:r>
@@ -6464,7 +6150,6 @@
           <w:rFonts w:ascii="Calibri" w:eastAsia="Times New Roman" w:hAnsi="Calibri" w:cs="Calibri"/>
         </w:rPr>
       </w:pPr>
-      <w:proofErr w:type="spellStart"/>
       <w:r>
         <w:rPr>
           <w:rFonts w:ascii="Consolas" w:eastAsiaTheme="minorHAnsi" w:hAnsi="Consolas" w:cs="Consolas"/>
@@ -6474,7 +6159,6 @@
         </w:rPr>
         <w:t>RDSBUrl</w:t>
       </w:r>
-      <w:proofErr w:type="spellEnd"/>
       <w:r>
         <w:rPr>
           <w:rFonts w:ascii="Consolas" w:eastAsiaTheme="minorHAnsi" w:hAnsi="Consolas" w:cs="Consolas"/>
@@ -6501,7 +6185,6 @@
           <w:rFonts w:ascii="Calibri" w:eastAsia="Times New Roman" w:hAnsi="Calibri" w:cs="Calibri"/>
         </w:rPr>
       </w:pPr>
-      <w:proofErr w:type="spellStart"/>
       <w:r>
         <w:rPr>
           <w:rFonts w:ascii="Consolas" w:eastAsiaTheme="minorHAnsi" w:hAnsi="Consolas" w:cs="Consolas"/>
@@ -6520,7 +6203,6 @@
         </w:rPr>
         <w:t>Url</w:t>
       </w:r>
-      <w:proofErr w:type="spellEnd"/>
       <w:r>
         <w:rPr>
           <w:rFonts w:ascii="Consolas" w:eastAsiaTheme="minorHAnsi" w:hAnsi="Consolas" w:cs="Consolas"/>
@@ -6657,25 +6339,14 @@
           <w:rFonts w:ascii="Calibri" w:eastAsia="Times New Roman" w:hAnsi="Calibri" w:cs="Calibri"/>
         </w:rPr>
       </w:pPr>
-      <w:proofErr w:type="spellStart"/>
-      <w:r>
-        <w:rPr>
-          <w:rFonts w:ascii="Consolas" w:eastAsiaTheme="minorHAnsi" w:hAnsi="Consolas" w:cs="Consolas"/>
-          <w:color w:val="0000FF"/>
-          <w:sz w:val="19"/>
-          <w:szCs w:val="19"/>
-        </w:rPr>
-        <w:t>LeadEstimators</w:t>
-      </w:r>
-      <w:proofErr w:type="spellEnd"/>
-      <w:r>
-        <w:rPr>
-          <w:rFonts w:ascii="Consolas" w:eastAsiaTheme="minorHAnsi" w:hAnsi="Consolas" w:cs="Consolas"/>
-          <w:color w:val="0000FF"/>
-          <w:sz w:val="19"/>
-          <w:szCs w:val="19"/>
-        </w:rPr>
-        <w:t xml:space="preserve"> </w:t>
+      <w:r>
+        <w:rPr>
+          <w:rFonts w:ascii="Consolas" w:eastAsiaTheme="minorHAnsi" w:hAnsi="Consolas" w:cs="Consolas"/>
+          <w:color w:val="0000FF"/>
+          <w:sz w:val="19"/>
+          <w:szCs w:val="19"/>
+        </w:rPr>
+        <w:t xml:space="preserve">LeadEstimators </w:t>
       </w:r>
       <w:r>
         <w:t xml:space="preserve">– set this </w:t>
@@ -6697,25 +6368,14 @@
           <w:rFonts w:ascii="Calibri" w:eastAsia="Times New Roman" w:hAnsi="Calibri" w:cs="Calibri"/>
         </w:rPr>
       </w:pPr>
-      <w:proofErr w:type="spellStart"/>
-      <w:r>
-        <w:rPr>
-          <w:rFonts w:ascii="Consolas" w:eastAsiaTheme="minorHAnsi" w:hAnsi="Consolas" w:cs="Consolas"/>
-          <w:color w:val="0000FF"/>
-          <w:sz w:val="19"/>
-          <w:szCs w:val="19"/>
-        </w:rPr>
-        <w:t>LOBLeads</w:t>
-      </w:r>
-      <w:proofErr w:type="spellEnd"/>
-      <w:r>
-        <w:rPr>
-          <w:rFonts w:ascii="Consolas" w:eastAsiaTheme="minorHAnsi" w:hAnsi="Consolas" w:cs="Consolas"/>
-          <w:color w:val="0000FF"/>
-          <w:sz w:val="19"/>
-          <w:szCs w:val="19"/>
-        </w:rPr>
-        <w:t xml:space="preserve"> </w:t>
+      <w:r>
+        <w:rPr>
+          <w:rFonts w:ascii="Consolas" w:eastAsiaTheme="minorHAnsi" w:hAnsi="Consolas" w:cs="Consolas"/>
+          <w:color w:val="0000FF"/>
+          <w:sz w:val="19"/>
+          <w:szCs w:val="19"/>
+        </w:rPr>
+        <w:t xml:space="preserve">LOBLeads </w:t>
       </w:r>
       <w:r>
         <w:t xml:space="preserve">– </w:t>
@@ -6746,25 +6406,14 @@
           <w:rFonts w:ascii="Calibri" w:eastAsia="Times New Roman" w:hAnsi="Calibri" w:cs="Calibri"/>
         </w:rPr>
       </w:pPr>
-      <w:proofErr w:type="spellStart"/>
-      <w:r>
-        <w:rPr>
-          <w:rFonts w:ascii="Consolas" w:eastAsiaTheme="minorHAnsi" w:hAnsi="Consolas" w:cs="Consolas"/>
-          <w:color w:val="0000FF"/>
-          <w:sz w:val="19"/>
-          <w:szCs w:val="19"/>
-        </w:rPr>
-        <w:t>LOBManagers</w:t>
-      </w:r>
-      <w:proofErr w:type="spellEnd"/>
-      <w:r>
-        <w:rPr>
-          <w:rFonts w:ascii="Consolas" w:eastAsiaTheme="minorHAnsi" w:hAnsi="Consolas" w:cs="Consolas"/>
-          <w:color w:val="0000FF"/>
-          <w:sz w:val="19"/>
-          <w:szCs w:val="19"/>
-        </w:rPr>
-        <w:t xml:space="preserve"> </w:t>
+      <w:r>
+        <w:rPr>
+          <w:rFonts w:ascii="Consolas" w:eastAsiaTheme="minorHAnsi" w:hAnsi="Consolas" w:cs="Consolas"/>
+          <w:color w:val="0000FF"/>
+          <w:sz w:val="19"/>
+          <w:szCs w:val="19"/>
+        </w:rPr>
+        <w:t xml:space="preserve">LOBManagers </w:t>
       </w:r>
       <w:r>
         <w:t>– set this to the appropriate AD group</w:t>
@@ -6783,25 +6432,14 @@
           <w:rFonts w:ascii="Calibri" w:eastAsia="Times New Roman" w:hAnsi="Calibri" w:cs="Calibri"/>
         </w:rPr>
       </w:pPr>
-      <w:proofErr w:type="spellStart"/>
-      <w:r>
-        <w:rPr>
-          <w:rFonts w:ascii="Consolas" w:eastAsiaTheme="minorHAnsi" w:hAnsi="Consolas" w:cs="Consolas"/>
-          <w:color w:val="0000FF"/>
-          <w:sz w:val="19"/>
-          <w:szCs w:val="19"/>
-        </w:rPr>
-        <w:t>CoverSheetApprovers</w:t>
-      </w:r>
-      <w:proofErr w:type="spellEnd"/>
-      <w:r>
-        <w:rPr>
-          <w:rFonts w:ascii="Consolas" w:eastAsiaTheme="minorHAnsi" w:hAnsi="Consolas" w:cs="Consolas"/>
-          <w:color w:val="0000FF"/>
-          <w:sz w:val="19"/>
-          <w:szCs w:val="19"/>
-        </w:rPr>
-        <w:t xml:space="preserve"> </w:t>
+      <w:r>
+        <w:rPr>
+          <w:rFonts w:ascii="Consolas" w:eastAsiaTheme="minorHAnsi" w:hAnsi="Consolas" w:cs="Consolas"/>
+          <w:color w:val="0000FF"/>
+          <w:sz w:val="19"/>
+          <w:szCs w:val="19"/>
+        </w:rPr>
+        <w:t xml:space="preserve">CoverSheetApprovers </w:t>
       </w:r>
       <w:r>
         <w:t xml:space="preserve">– </w:t>
@@ -6823,25 +6461,14 @@
           <w:rFonts w:ascii="Calibri" w:eastAsia="Times New Roman" w:hAnsi="Calibri" w:cs="Calibri"/>
         </w:rPr>
       </w:pPr>
-      <w:proofErr w:type="spellStart"/>
-      <w:r>
-        <w:rPr>
-          <w:rFonts w:ascii="Consolas" w:eastAsiaTheme="minorHAnsi" w:hAnsi="Consolas" w:cs="Consolas"/>
-          <w:color w:val="0000FF"/>
-          <w:sz w:val="19"/>
-          <w:szCs w:val="19"/>
-        </w:rPr>
-        <w:t>PricingVerifications</w:t>
-      </w:r>
-      <w:proofErr w:type="spellEnd"/>
-      <w:r>
-        <w:rPr>
-          <w:rFonts w:ascii="Consolas" w:eastAsiaTheme="minorHAnsi" w:hAnsi="Consolas" w:cs="Consolas"/>
-          <w:color w:val="0000FF"/>
-          <w:sz w:val="19"/>
-          <w:szCs w:val="19"/>
-        </w:rPr>
-        <w:t xml:space="preserve"> </w:t>
+      <w:r>
+        <w:rPr>
+          <w:rFonts w:ascii="Consolas" w:eastAsiaTheme="minorHAnsi" w:hAnsi="Consolas" w:cs="Consolas"/>
+          <w:color w:val="0000FF"/>
+          <w:sz w:val="19"/>
+          <w:szCs w:val="19"/>
+        </w:rPr>
+        <w:t xml:space="preserve">PricingVerifications </w:t>
       </w:r>
       <w:r>
         <w:t xml:space="preserve">– </w:t>
@@ -6863,25 +6490,14 @@
           <w:rFonts w:ascii="Calibri" w:eastAsia="Times New Roman" w:hAnsi="Calibri" w:cs="Calibri"/>
         </w:rPr>
       </w:pPr>
-      <w:proofErr w:type="spellStart"/>
-      <w:r>
-        <w:rPr>
-          <w:rFonts w:ascii="Consolas" w:eastAsiaTheme="minorHAnsi" w:hAnsi="Consolas" w:cs="Consolas"/>
-          <w:color w:val="0000FF"/>
-          <w:sz w:val="19"/>
-          <w:szCs w:val="19"/>
-        </w:rPr>
-        <w:t>IndependentReviewers</w:t>
-      </w:r>
-      <w:proofErr w:type="spellEnd"/>
-      <w:r>
-        <w:rPr>
-          <w:rFonts w:ascii="Consolas" w:eastAsiaTheme="minorHAnsi" w:hAnsi="Consolas" w:cs="Consolas"/>
-          <w:color w:val="0000FF"/>
-          <w:sz w:val="19"/>
-          <w:szCs w:val="19"/>
-        </w:rPr>
-        <w:t xml:space="preserve"> </w:t>
+      <w:r>
+        <w:rPr>
+          <w:rFonts w:ascii="Consolas" w:eastAsiaTheme="minorHAnsi" w:hAnsi="Consolas" w:cs="Consolas"/>
+          <w:color w:val="0000FF"/>
+          <w:sz w:val="19"/>
+          <w:szCs w:val="19"/>
+        </w:rPr>
+        <w:t xml:space="preserve">IndependentReviewers </w:t>
       </w:r>
       <w:r>
         <w:t xml:space="preserve">– </w:t>
@@ -6903,7 +6519,6 @@
           <w:rFonts w:ascii="Calibri" w:eastAsia="Times New Roman" w:hAnsi="Calibri" w:cs="Calibri"/>
         </w:rPr>
       </w:pPr>
-      <w:proofErr w:type="spellStart"/>
       <w:r>
         <w:rPr>
           <w:rFonts w:ascii="Consolas" w:eastAsiaTheme="minorHAnsi" w:hAnsi="Consolas" w:cs="Consolas"/>
@@ -6914,7 +6529,6 @@
         </w:rPr>
         <w:t>system.web</w:t>
       </w:r>
-      <w:proofErr w:type="spellEnd"/>
       <w:r>
         <w:rPr>
           <w:rFonts w:ascii="Consolas" w:eastAsiaTheme="minorHAnsi" w:hAnsi="Consolas" w:cs="Consolas"/>
@@ -7067,7 +6681,6 @@
         </w:rPr>
         <w:t>"</w:t>
       </w:r>
-      <w:proofErr w:type="spellStart"/>
       <w:r>
         <w:rPr>
           <w:rFonts w:ascii="Consolas" w:eastAsiaTheme="minorHAnsi" w:hAnsi="Consolas" w:cs="Consolas"/>
@@ -7078,7 +6691,6 @@
         </w:rPr>
         <w:t>elmah.axd</w:t>
       </w:r>
-      <w:proofErr w:type="spellEnd"/>
       <w:r>
         <w:rPr>
           <w:rFonts w:ascii="Consolas" w:eastAsiaTheme="minorHAnsi" w:hAnsi="Consolas" w:cs="Consolas"/>
@@ -7105,7 +6717,6 @@
         </w:rPr>
         <w:t xml:space="preserve">-&gt; </w:t>
       </w:r>
-      <w:proofErr w:type="spellStart"/>
       <w:r>
         <w:rPr>
           <w:rFonts w:ascii="Consolas" w:eastAsiaTheme="minorHAnsi" w:hAnsi="Consolas" w:cs="Consolas"/>
@@ -7116,7 +6727,6 @@
         </w:rPr>
         <w:t>system.web</w:t>
       </w:r>
-      <w:proofErr w:type="spellEnd"/>
       <w:r>
         <w:rPr>
           <w:rFonts w:ascii="Consolas" w:eastAsiaTheme="minorHAnsi" w:hAnsi="Consolas" w:cs="Consolas"/>
@@ -7404,7 +7014,6 @@
         </w:rPr>
         <w:t xml:space="preserve"> </w:t>
       </w:r>
-      <w:proofErr w:type="spellStart"/>
       <w:r>
         <w:rPr>
           <w:rFonts w:ascii="Consolas" w:eastAsiaTheme="minorHAnsi" w:hAnsi="Consolas" w:cs="Consolas"/>
@@ -7414,7 +7023,6 @@
         </w:rPr>
         <w:t>stopProcessing</w:t>
       </w:r>
-      <w:proofErr w:type="spellEnd"/>
       <w:r>
         <w:rPr>
           <w:rFonts w:ascii="Consolas" w:eastAsiaTheme="minorHAnsi" w:hAnsi="Consolas" w:cs="Consolas"/>
@@ -7472,7 +7080,6 @@
         </w:rPr>
         <w:t xml:space="preserve">          &lt;match </w:t>
       </w:r>
-      <w:proofErr w:type="spellStart"/>
       <w:r>
         <w:rPr>
           <w:rFonts w:ascii="Consolas" w:eastAsiaTheme="minorHAnsi" w:hAnsi="Consolas" w:cs="Consolas"/>
@@ -7482,7 +7089,6 @@
         </w:rPr>
         <w:t>url</w:t>
       </w:r>
-      <w:proofErr w:type="spellEnd"/>
       <w:r>
         <w:rPr>
           <w:rFonts w:ascii="Consolas" w:eastAsiaTheme="minorHAnsi" w:hAnsi="Consolas" w:cs="Consolas"/>
@@ -7490,9 +7096,68 @@
           <w:sz w:val="19"/>
           <w:szCs w:val="19"/>
         </w:rPr>
-        <w:t>="</w:t>
-      </w:r>
-      <w:proofErr w:type="gramStart"/>
+        <w:t>="(.*)"</w:t>
+      </w:r>
+      <w:r>
+        <w:rPr>
+          <w:rFonts w:ascii="Consolas" w:eastAsiaTheme="minorHAnsi" w:hAnsi="Consolas" w:cs="Consolas"/>
+          <w:color w:val="0000FF"/>
+          <w:sz w:val="19"/>
+          <w:szCs w:val="19"/>
+        </w:rPr>
+        <w:t xml:space="preserve"> /&gt;</w:t>
+      </w:r>
+    </w:p>
+    <w:p>
+      <w:pPr>
+        <w:pStyle w:val="ListParagraph"/>
+        <w:spacing w:line="240" w:lineRule="auto"/>
+        <w:rPr>
+          <w:rFonts w:ascii="Consolas" w:eastAsiaTheme="minorHAnsi" w:hAnsi="Consolas" w:cs="Consolas"/>
+          <w:color w:val="0000FF"/>
+          <w:sz w:val="19"/>
+          <w:szCs w:val="19"/>
+        </w:rPr>
+      </w:pPr>
+      <w:r>
+        <w:rPr>
+          <w:rFonts w:ascii="Consolas" w:eastAsiaTheme="minorHAnsi" w:hAnsi="Consolas" w:cs="Consolas"/>
+          <w:color w:val="0000FF"/>
+          <w:sz w:val="19"/>
+          <w:szCs w:val="19"/>
+        </w:rPr>
+        <w:t xml:space="preserve">          &lt;conditions&gt;</w:t>
+      </w:r>
+    </w:p>
+    <w:p>
+      <w:pPr>
+        <w:pStyle w:val="ListParagraph"/>
+        <w:spacing w:line="240" w:lineRule="auto"/>
+        <w:rPr>
+          <w:rFonts w:ascii="Consolas" w:eastAsiaTheme="minorHAnsi" w:hAnsi="Consolas" w:cs="Consolas"/>
+          <w:color w:val="0000FF"/>
+          <w:sz w:val="19"/>
+          <w:szCs w:val="19"/>
+        </w:rPr>
+      </w:pPr>
+      <w:r>
+        <w:rPr>
+          <w:rFonts w:ascii="Consolas" w:eastAsiaTheme="minorHAnsi" w:hAnsi="Consolas" w:cs="Consolas"/>
+          <w:color w:val="0000FF"/>
+          <w:sz w:val="19"/>
+          <w:szCs w:val="19"/>
+        </w:rPr>
+        <w:t xml:space="preserve">            &lt;add </w:t>
+      </w:r>
+      <w:r>
+        <w:rPr>
+          <w:rFonts w:ascii="Consolas" w:eastAsiaTheme="minorHAnsi" w:hAnsi="Consolas" w:cs="Consolas"/>
+          <w:color w:val="FF0000"/>
+          <w:sz w:val="19"/>
+          <w:szCs w:val="19"/>
+        </w:rPr>
+        <w:t>input</w:t>
+      </w:r>
       <w:r>
         <w:rPr>
           <w:rFonts w:ascii="Consolas" w:eastAsiaTheme="minorHAnsi" w:hAnsi="Consolas" w:cs="Consolas"/>
@@ -7500,9 +7165,26 @@
           <w:sz w:val="19"/>
           <w:szCs w:val="19"/>
         </w:rPr>
-        <w:t>(.*</w:t>
-      </w:r>
-      <w:proofErr w:type="gramEnd"/>
+        <w:t>="{HTTPS}"</w:t>
+      </w:r>
+      <w:r>
+        <w:rPr>
+          <w:rFonts w:ascii="Consolas" w:eastAsiaTheme="minorHAnsi" w:hAnsi="Consolas" w:cs="Consolas"/>
+          <w:color w:val="0000FF"/>
+          <w:sz w:val="19"/>
+          <w:szCs w:val="19"/>
+        </w:rPr>
+        <w:t xml:space="preserve"> </w:t>
+      </w:r>
+      <w:r>
+        <w:rPr>
+          <w:rFonts w:ascii="Consolas" w:eastAsiaTheme="minorHAnsi" w:hAnsi="Consolas" w:cs="Consolas"/>
+          <w:color w:val="FF0000"/>
+          <w:sz w:val="19"/>
+          <w:szCs w:val="19"/>
+        </w:rPr>
+        <w:t>pattern</w:t>
+      </w:r>
       <w:r>
         <w:rPr>
           <w:rFonts w:ascii="Consolas" w:eastAsiaTheme="minorHAnsi" w:hAnsi="Consolas" w:cs="Consolas"/>
@@ -7510,7 +7192,7 @@
           <w:sz w:val="19"/>
           <w:szCs w:val="19"/>
         </w:rPr>
-        <w:t>)"</w:t>
+        <w:t>="^OFF$"</w:t>
       </w:r>
       <w:r>
         <w:rPr>
@@ -7540,7 +7222,7 @@
           <w:sz w:val="19"/>
           <w:szCs w:val="19"/>
         </w:rPr>
-        <w:t xml:space="preserve">          &lt;conditions&gt;</w:t>
+        <w:t xml:space="preserve">          &lt;/conditions&gt;</w:t>
       </w:r>
     </w:p>
     <w:p>
@@ -7561,7 +7243,7 @@
           <w:sz w:val="19"/>
           <w:szCs w:val="19"/>
         </w:rPr>
-        <w:t xml:space="preserve">            &lt;add </w:t>
+        <w:t xml:space="preserve">          &lt;action </w:t>
       </w:r>
       <w:r>
         <w:rPr>
@@ -7570,7 +7252,7 @@
           <w:sz w:val="19"/>
           <w:szCs w:val="19"/>
         </w:rPr>
-        <w:t>input</w:t>
+        <w:t>type</w:t>
       </w:r>
       <w:r>
         <w:rPr>
@@ -7579,16 +7261,7 @@
           <w:sz w:val="19"/>
           <w:szCs w:val="19"/>
         </w:rPr>
-        <w:t>="{HTTPS}"</w:t>
-      </w:r>
-      <w:r>
-        <w:rPr>
-          <w:rFonts w:ascii="Consolas" w:eastAsiaTheme="minorHAnsi" w:hAnsi="Consolas" w:cs="Consolas"/>
-          <w:color w:val="0000FF"/>
-          <w:sz w:val="19"/>
-          <w:szCs w:val="19"/>
-        </w:rPr>
-        <w:t xml:space="preserve"> </w:t>
+        <w:t xml:space="preserve">="Redirect" </w:t>
       </w:r>
       <w:r>
         <w:rPr>
@@ -7597,7 +7270,7 @@
           <w:sz w:val="19"/>
           <w:szCs w:val="19"/>
         </w:rPr>
-        <w:t>pattern</w:t>
+        <w:t>url</w:t>
       </w:r>
       <w:r>
         <w:rPr>
@@ -7606,7 +7279,7 @@
           <w:sz w:val="19"/>
           <w:szCs w:val="19"/>
         </w:rPr>
-        <w:t>="^OFF$"</w:t>
+        <w:t>="https://{HTTP_HOST}/{R:1}"</w:t>
       </w:r>
       <w:r>
         <w:rPr>
@@ -7636,7 +7309,7 @@
           <w:sz w:val="19"/>
           <w:szCs w:val="19"/>
         </w:rPr>
-        <w:t xml:space="preserve">          &lt;/conditions&gt;</w:t>
+        <w:t xml:space="preserve">        &lt;/rule&gt;</w:t>
       </w:r>
     </w:p>
     <w:p>
@@ -7657,54 +7330,7 @@
           <w:sz w:val="19"/>
           <w:szCs w:val="19"/>
         </w:rPr>
-        <w:t xml:space="preserve">          &lt;action </w:t>
-      </w:r>
-      <w:r>
-        <w:rPr>
-          <w:rFonts w:ascii="Consolas" w:eastAsiaTheme="minorHAnsi" w:hAnsi="Consolas" w:cs="Consolas"/>
-          <w:color w:val="FF0000"/>
-          <w:sz w:val="19"/>
-          <w:szCs w:val="19"/>
-        </w:rPr>
-        <w:t>type</w:t>
-      </w:r>
-      <w:r>
-        <w:rPr>
-          <w:rFonts w:ascii="Consolas" w:eastAsiaTheme="minorHAnsi" w:hAnsi="Consolas" w:cs="Consolas"/>
-          <w:color w:val="8064A2" w:themeColor="accent4"/>
-          <w:sz w:val="19"/>
-          <w:szCs w:val="19"/>
-        </w:rPr>
-        <w:t xml:space="preserve">="Redirect" </w:t>
-      </w:r>
-      <w:proofErr w:type="spellStart"/>
-      <w:r>
-        <w:rPr>
-          <w:rFonts w:ascii="Consolas" w:eastAsiaTheme="minorHAnsi" w:hAnsi="Consolas" w:cs="Consolas"/>
-          <w:color w:val="FF0000"/>
-          <w:sz w:val="19"/>
-          <w:szCs w:val="19"/>
-        </w:rPr>
-        <w:t>url</w:t>
-      </w:r>
-      <w:proofErr w:type="spellEnd"/>
-      <w:r>
-        <w:rPr>
-          <w:rFonts w:ascii="Consolas" w:eastAsiaTheme="minorHAnsi" w:hAnsi="Consolas" w:cs="Consolas"/>
-          <w:color w:val="8064A2" w:themeColor="accent4"/>
-          <w:sz w:val="19"/>
-          <w:szCs w:val="19"/>
-        </w:rPr>
-        <w:t>="https://{HTTP_HOST}/{R:1}"</w:t>
-      </w:r>
-      <w:r>
-        <w:rPr>
-          <w:rFonts w:ascii="Consolas" w:eastAsiaTheme="minorHAnsi" w:hAnsi="Consolas" w:cs="Consolas"/>
-          <w:color w:val="0000FF"/>
-          <w:sz w:val="19"/>
-          <w:szCs w:val="19"/>
-        </w:rPr>
-        <w:t xml:space="preserve"> /&gt;</w:t>
+        <w:t xml:space="preserve">      &lt;/rules&gt;</w:t>
       </w:r>
     </w:p>
     <w:p>
@@ -7712,48 +7338,6 @@
         <w:pStyle w:val="ListParagraph"/>
         <w:spacing w:line="240" w:lineRule="auto"/>
         <w:rPr>
-          <w:rFonts w:ascii="Consolas" w:eastAsiaTheme="minorHAnsi" w:hAnsi="Consolas" w:cs="Consolas"/>
-          <w:color w:val="0000FF"/>
-          <w:sz w:val="19"/>
-          <w:szCs w:val="19"/>
-        </w:rPr>
-      </w:pPr>
-      <w:r>
-        <w:rPr>
-          <w:rFonts w:ascii="Consolas" w:eastAsiaTheme="minorHAnsi" w:hAnsi="Consolas" w:cs="Consolas"/>
-          <w:color w:val="0000FF"/>
-          <w:sz w:val="19"/>
-          <w:szCs w:val="19"/>
-        </w:rPr>
-        <w:t xml:space="preserve">        &lt;/rule&gt;</w:t>
-      </w:r>
-    </w:p>
-    <w:p>
-      <w:pPr>
-        <w:pStyle w:val="ListParagraph"/>
-        <w:spacing w:line="240" w:lineRule="auto"/>
-        <w:rPr>
-          <w:rFonts w:ascii="Consolas" w:eastAsiaTheme="minorHAnsi" w:hAnsi="Consolas" w:cs="Consolas"/>
-          <w:color w:val="0000FF"/>
-          <w:sz w:val="19"/>
-          <w:szCs w:val="19"/>
-        </w:rPr>
-      </w:pPr>
-      <w:r>
-        <w:rPr>
-          <w:rFonts w:ascii="Consolas" w:eastAsiaTheme="minorHAnsi" w:hAnsi="Consolas" w:cs="Consolas"/>
-          <w:color w:val="0000FF"/>
-          <w:sz w:val="19"/>
-          <w:szCs w:val="19"/>
-        </w:rPr>
-        <w:t xml:space="preserve">      &lt;/rules&gt;</w:t>
-      </w:r>
-    </w:p>
-    <w:p>
-      <w:pPr>
-        <w:pStyle w:val="ListParagraph"/>
-        <w:spacing w:line="240" w:lineRule="auto"/>
-        <w:rPr>
           <w:rFonts w:ascii="Calibri" w:eastAsia="Times New Roman" w:hAnsi="Calibri" w:cs="Calibri"/>
         </w:rPr>
       </w:pPr>
@@ -7776,15 +7360,7 @@
         <w:t>Appendix D</w:t>
       </w:r>
       <w:r>
-        <w:t xml:space="preserve">: RDM </w:t>
-      </w:r>
-      <w:proofErr w:type="spellStart"/>
-      <w:r>
-        <w:t>Web.Config</w:t>
-      </w:r>
-      <w:proofErr w:type="spellEnd"/>
-      <w:r>
-        <w:t xml:space="preserve"> Customization</w:t>
+        <w:t>: RDM Web.Config Customization</w:t>
       </w:r>
       <w:bookmarkEnd w:id="36"/>
     </w:p>
@@ -7823,7 +7399,6 @@
         </w:numPr>
         <w:spacing w:after="0"/>
       </w:pPr>
-      <w:proofErr w:type="spellStart"/>
       <w:r>
         <w:rPr>
           <w:rFonts w:ascii="Consolas" w:eastAsiaTheme="minorHAnsi" w:hAnsi="Consolas" w:cs="Consolas"/>
@@ -7833,7 +7408,6 @@
         </w:rPr>
         <w:t>IESEntities</w:t>
       </w:r>
-      <w:proofErr w:type="spellEnd"/>
       <w:r>
         <w:rPr>
           <w:rFonts w:ascii="Calibri" w:eastAsia="Times New Roman" w:hAnsi="Calibri" w:cs="Calibri"/>
@@ -7916,7 +7490,6 @@
           <w:rFonts w:ascii="Calibri" w:eastAsia="Times New Roman" w:hAnsi="Calibri" w:cs="Calibri"/>
         </w:rPr>
       </w:pPr>
-      <w:proofErr w:type="spellStart"/>
       <w:r>
         <w:rPr>
           <w:rFonts w:ascii="Consolas" w:eastAsiaTheme="minorHAnsi" w:hAnsi="Consolas" w:cs="Consolas"/>
@@ -7927,7 +7500,6 @@
         </w:rPr>
         <w:t>EmailServer</w:t>
       </w:r>
-      <w:proofErr w:type="spellEnd"/>
       <w:r>
         <w:t xml:space="preserve"> </w:t>
       </w:r>
@@ -7950,7 +7522,6 @@
           <w:rFonts w:ascii="Calibri" w:eastAsia="Times New Roman" w:hAnsi="Calibri" w:cs="Calibri"/>
         </w:rPr>
       </w:pPr>
-      <w:proofErr w:type="spellStart"/>
       <w:r>
         <w:rPr>
           <w:rFonts w:ascii="Consolas" w:eastAsiaTheme="minorHAnsi" w:hAnsi="Consolas" w:cs="Consolas"/>
@@ -7961,7 +7532,6 @@
         </w:rPr>
         <w:t>ActiveDirectoryPath</w:t>
       </w:r>
-      <w:proofErr w:type="spellEnd"/>
       <w:r>
         <w:t xml:space="preserve"> </w:t>
       </w:r>
@@ -7984,7 +7554,6 @@
           <w:rFonts w:ascii="Calibri" w:eastAsia="Times New Roman" w:hAnsi="Calibri" w:cs="Calibri"/>
         </w:rPr>
       </w:pPr>
-      <w:proofErr w:type="spellStart"/>
       <w:r>
         <w:rPr>
           <w:rFonts w:ascii="Consolas" w:eastAsiaTheme="minorHAnsi" w:hAnsi="Consolas" w:cs="Consolas"/>
@@ -7995,7 +7564,6 @@
         </w:rPr>
         <w:t>ServerURL</w:t>
       </w:r>
-      <w:proofErr w:type="spellEnd"/>
       <w:r>
         <w:rPr>
           <w:rFonts w:eastAsiaTheme="minorHAnsi" w:cs="Consolas"/>
@@ -8019,7 +7587,6 @@
           <w:rFonts w:ascii="Calibri" w:eastAsia="Times New Roman" w:hAnsi="Calibri" w:cs="Calibri"/>
         </w:rPr>
       </w:pPr>
-      <w:proofErr w:type="spellStart"/>
       <w:r>
         <w:rPr>
           <w:rFonts w:ascii="Consolas" w:eastAsiaTheme="minorHAnsi" w:hAnsi="Consolas" w:cs="Consolas"/>
@@ -8031,7 +7598,6 @@
         <w:lastRenderedPageBreak/>
         <w:t>HelpdeskEmailAddress</w:t>
       </w:r>
-      <w:proofErr w:type="spellEnd"/>
       <w:r>
         <w:t xml:space="preserve"> – email displayed to the users to contact for help</w:t>
       </w:r>
@@ -8049,7 +7615,6 @@
           <w:rFonts w:ascii="Calibri" w:eastAsia="Times New Roman" w:hAnsi="Calibri" w:cs="Calibri"/>
         </w:rPr>
       </w:pPr>
-      <w:proofErr w:type="spellStart"/>
       <w:r>
         <w:rPr>
           <w:rFonts w:ascii="Consolas" w:eastAsiaTheme="minorHAnsi" w:hAnsi="Consolas" w:cs="Consolas"/>
@@ -8059,7 +7624,6 @@
         </w:rPr>
         <w:t>IESHeaderUrl</w:t>
       </w:r>
-      <w:proofErr w:type="spellEnd"/>
       <w:r>
         <w:t xml:space="preserve"> – if IES portal is installed, put in the URL to it; otherwise leave blank</w:t>
       </w:r>
@@ -8100,7 +7664,6 @@
         <w:spacing w:after="0"/>
         <w:textAlignment w:val="center"/>
       </w:pPr>
-      <w:proofErr w:type="spellStart"/>
       <w:r>
         <w:rPr>
           <w:rFonts w:ascii="Consolas" w:eastAsiaTheme="minorHAnsi" w:hAnsi="Consolas" w:cs="Consolas"/>
@@ -8110,7 +7673,6 @@
         </w:rPr>
         <w:t>EstimatingDataGroupDL</w:t>
       </w:r>
-      <w:proofErr w:type="spellEnd"/>
       <w:r>
         <w:t xml:space="preserve">– </w:t>
       </w:r>
@@ -8128,6 +7690,74 @@
           <w:vertAlign w:val="superscript"/>
         </w:rPr>
         <w:t>1</w:t>
+      </w:r>
+    </w:p>
+    <w:p>
+      <w:pPr>
+        <w:pStyle w:val="ListParagraph"/>
+        <w:numPr>
+          <w:ilvl w:val="1"/>
+          <w:numId w:val="16"/>
+        </w:numPr>
+        <w:spacing w:after="0"/>
+        <w:textAlignment w:val="center"/>
+        <w:rPr>
+          <w:rFonts w:ascii="Calibri" w:eastAsia="Times New Roman" w:hAnsi="Calibri" w:cs="Calibri"/>
+        </w:rPr>
+      </w:pPr>
+      <w:r>
+        <w:rPr>
+          <w:rFonts w:ascii="Consolas" w:eastAsiaTheme="minorHAnsi" w:hAnsi="Consolas" w:cs="Consolas"/>
+          <w:color w:val="0000FF"/>
+          <w:sz w:val="19"/>
+          <w:szCs w:val="19"/>
+        </w:rPr>
+        <w:t>HideNonPortionMarking</w:t>
+      </w:r>
+      <w:r>
+        <w:rPr>
+          <w:rFonts w:ascii="Consolas" w:eastAsiaTheme="minorHAnsi" w:hAnsi="Consolas" w:cs="Consolas"/>
+          <w:color w:val="0000FF"/>
+          <w:sz w:val="19"/>
+          <w:szCs w:val="19"/>
+        </w:rPr>
+        <w:t xml:space="preserve"> </w:t>
+      </w:r>
+      <w:r>
+        <w:t xml:space="preserve">– </w:t>
+      </w:r>
+      <w:r>
+        <w:t>set this to false, h</w:t>
+      </w:r>
+      <w:r>
+        <w:t>ide</w:t>
+      </w:r>
+      <w:r>
+        <w:t>s</w:t>
+      </w:r>
+      <w:r>
+        <w:t xml:space="preserve"> the </w:t>
+      </w:r>
+      <w:r>
+        <w:t>n</w:t>
+      </w:r>
+      <w:r>
+        <w:t>on-</w:t>
+      </w:r>
+      <w:r>
+        <w:t>p</w:t>
+      </w:r>
+      <w:r>
+        <w:t xml:space="preserve">ortion </w:t>
+      </w:r>
+      <w:r>
+        <w:t>m</w:t>
+      </w:r>
+      <w:r>
+        <w:t>arking buttons</w:t>
+      </w:r>
+      <w:r>
+        <w:t>;</w:t>
       </w:r>
     </w:p>
     <w:p>
@@ -8254,25 +7884,14 @@
           <w:rFonts w:ascii="Calibri" w:eastAsia="Times New Roman" w:hAnsi="Calibri" w:cs="Calibri"/>
         </w:rPr>
       </w:pPr>
-      <w:proofErr w:type="spellStart"/>
-      <w:r>
-        <w:rPr>
-          <w:rFonts w:ascii="Consolas" w:eastAsiaTheme="minorHAnsi" w:hAnsi="Consolas" w:cs="Consolas"/>
-          <w:color w:val="0000FF"/>
-          <w:sz w:val="19"/>
-          <w:szCs w:val="19"/>
-        </w:rPr>
-        <w:t>RDMAdminGroups</w:t>
-      </w:r>
-      <w:proofErr w:type="spellEnd"/>
-      <w:r>
-        <w:rPr>
-          <w:rFonts w:ascii="Consolas" w:eastAsiaTheme="minorHAnsi" w:hAnsi="Consolas" w:cs="Consolas"/>
-          <w:color w:val="0000FF"/>
-          <w:sz w:val="19"/>
-          <w:szCs w:val="19"/>
-        </w:rPr>
-        <w:t xml:space="preserve"> </w:t>
+      <w:r>
+        <w:rPr>
+          <w:rFonts w:ascii="Consolas" w:eastAsiaTheme="minorHAnsi" w:hAnsi="Consolas" w:cs="Consolas"/>
+          <w:color w:val="0000FF"/>
+          <w:sz w:val="19"/>
+          <w:szCs w:val="19"/>
+        </w:rPr>
+        <w:t xml:space="preserve">RDMAdminGroups </w:t>
       </w:r>
       <w:r>
         <w:t>– admin users;</w:t>
@@ -8291,25 +7910,14 @@
           <w:rFonts w:ascii="Calibri" w:eastAsia="Times New Roman" w:hAnsi="Calibri" w:cs="Calibri"/>
         </w:rPr>
       </w:pPr>
-      <w:proofErr w:type="spellStart"/>
-      <w:r>
-        <w:rPr>
-          <w:rFonts w:ascii="Consolas" w:eastAsiaTheme="minorHAnsi" w:hAnsi="Consolas" w:cs="Consolas"/>
-          <w:color w:val="0000FF"/>
-          <w:sz w:val="19"/>
-          <w:szCs w:val="19"/>
-        </w:rPr>
-        <w:t>RDMCobraAdminGroups</w:t>
-      </w:r>
-      <w:proofErr w:type="spellEnd"/>
-      <w:r>
-        <w:rPr>
-          <w:rFonts w:ascii="Consolas" w:eastAsiaTheme="minorHAnsi" w:hAnsi="Consolas" w:cs="Consolas"/>
-          <w:color w:val="0000FF"/>
-          <w:sz w:val="19"/>
-          <w:szCs w:val="19"/>
-        </w:rPr>
-        <w:t xml:space="preserve"> </w:t>
+      <w:r>
+        <w:rPr>
+          <w:rFonts w:ascii="Consolas" w:eastAsiaTheme="minorHAnsi" w:hAnsi="Consolas" w:cs="Consolas"/>
+          <w:color w:val="0000FF"/>
+          <w:sz w:val="19"/>
+          <w:szCs w:val="19"/>
+        </w:rPr>
+        <w:t xml:space="preserve">RDMCobraAdminGroups </w:t>
       </w:r>
       <w:r>
         <w:t xml:space="preserve">– </w:t>
@@ -8334,25 +7942,14 @@
           <w:rFonts w:ascii="Calibri" w:eastAsia="Times New Roman" w:hAnsi="Calibri" w:cs="Calibri"/>
         </w:rPr>
       </w:pPr>
-      <w:proofErr w:type="spellStart"/>
-      <w:r>
-        <w:rPr>
-          <w:rFonts w:ascii="Consolas" w:eastAsiaTheme="minorHAnsi" w:hAnsi="Consolas" w:cs="Consolas"/>
-          <w:color w:val="0000FF"/>
-          <w:sz w:val="19"/>
-          <w:szCs w:val="19"/>
-        </w:rPr>
-        <w:t>RDMViewerGroups</w:t>
-      </w:r>
-      <w:proofErr w:type="spellEnd"/>
-      <w:r>
-        <w:rPr>
-          <w:rFonts w:ascii="Consolas" w:eastAsiaTheme="minorHAnsi" w:hAnsi="Consolas" w:cs="Consolas"/>
-          <w:color w:val="0000FF"/>
-          <w:sz w:val="19"/>
-          <w:szCs w:val="19"/>
-        </w:rPr>
-        <w:t xml:space="preserve"> </w:t>
+      <w:r>
+        <w:rPr>
+          <w:rFonts w:ascii="Consolas" w:eastAsiaTheme="minorHAnsi" w:hAnsi="Consolas" w:cs="Consolas"/>
+          <w:color w:val="0000FF"/>
+          <w:sz w:val="19"/>
+          <w:szCs w:val="19"/>
+        </w:rPr>
+        <w:t xml:space="preserve">RDMViewerGroups </w:t>
       </w:r>
       <w:r>
         <w:t xml:space="preserve">– all users that need to have </w:t>
@@ -8380,7 +7977,6 @@
           <w:rFonts w:ascii="Calibri" w:eastAsia="Times New Roman" w:hAnsi="Calibri" w:cs="Calibri"/>
         </w:rPr>
       </w:pPr>
-      <w:proofErr w:type="spellStart"/>
       <w:r>
         <w:rPr>
           <w:rFonts w:ascii="Consolas" w:eastAsiaTheme="minorHAnsi" w:hAnsi="Consolas" w:cs="Consolas"/>
@@ -8391,7 +7987,6 @@
         </w:rPr>
         <w:t>system.web</w:t>
       </w:r>
-      <w:proofErr w:type="spellEnd"/>
       <w:r>
         <w:rPr>
           <w:rFonts w:ascii="Consolas" w:eastAsiaTheme="minorHAnsi" w:hAnsi="Consolas" w:cs="Consolas"/>
@@ -8544,7 +8139,6 @@
         </w:rPr>
         <w:t>"</w:t>
       </w:r>
-      <w:proofErr w:type="spellStart"/>
       <w:r>
         <w:rPr>
           <w:rFonts w:ascii="Consolas" w:eastAsiaTheme="minorHAnsi" w:hAnsi="Consolas" w:cs="Consolas"/>
@@ -8555,7 +8149,6 @@
         </w:rPr>
         <w:t>elmah.axd</w:t>
       </w:r>
-      <w:proofErr w:type="spellEnd"/>
       <w:r>
         <w:rPr>
           <w:rFonts w:ascii="Consolas" w:eastAsiaTheme="minorHAnsi" w:hAnsi="Consolas" w:cs="Consolas"/>
@@ -8582,7 +8175,6 @@
         </w:rPr>
         <w:t xml:space="preserve">-&gt; </w:t>
       </w:r>
-      <w:proofErr w:type="spellStart"/>
       <w:r>
         <w:rPr>
           <w:rFonts w:ascii="Consolas" w:eastAsiaTheme="minorHAnsi" w:hAnsi="Consolas" w:cs="Consolas"/>
@@ -8593,7 +8185,6 @@
         </w:rPr>
         <w:t>system.web</w:t>
       </w:r>
-      <w:proofErr w:type="spellEnd"/>
       <w:r>
         <w:rPr>
           <w:rFonts w:ascii="Consolas" w:eastAsiaTheme="minorHAnsi" w:hAnsi="Consolas" w:cs="Consolas"/>
@@ -8890,7 +8481,6 @@
         </w:rPr>
         <w:t xml:space="preserve"> </w:t>
       </w:r>
-      <w:proofErr w:type="spellStart"/>
       <w:r>
         <w:rPr>
           <w:rFonts w:ascii="Consolas" w:eastAsiaTheme="minorHAnsi" w:hAnsi="Consolas" w:cs="Consolas"/>
@@ -8900,7 +8490,6 @@
         </w:rPr>
         <w:t>stopProcessing</w:t>
       </w:r>
-      <w:proofErr w:type="spellEnd"/>
       <w:r>
         <w:rPr>
           <w:rFonts w:ascii="Consolas" w:eastAsiaTheme="minorHAnsi" w:hAnsi="Consolas" w:cs="Consolas"/>
@@ -8958,7 +8547,6 @@
         </w:rPr>
         <w:t xml:space="preserve">          &lt;match </w:t>
       </w:r>
-      <w:proofErr w:type="spellStart"/>
       <w:r>
         <w:rPr>
           <w:rFonts w:ascii="Consolas" w:eastAsiaTheme="minorHAnsi" w:hAnsi="Consolas" w:cs="Consolas"/>
@@ -8968,7 +8556,6 @@
         </w:rPr>
         <w:t>url</w:t>
       </w:r>
-      <w:proofErr w:type="spellEnd"/>
       <w:r>
         <w:rPr>
           <w:rFonts w:ascii="Consolas" w:eastAsiaTheme="minorHAnsi" w:hAnsi="Consolas" w:cs="Consolas"/>
@@ -8976,9 +8563,68 @@
           <w:sz w:val="19"/>
           <w:szCs w:val="19"/>
         </w:rPr>
-        <w:t>="</w:t>
-      </w:r>
-      <w:proofErr w:type="gramStart"/>
+        <w:t>="(.*)"</w:t>
+      </w:r>
+      <w:r>
+        <w:rPr>
+          <w:rFonts w:ascii="Consolas" w:eastAsiaTheme="minorHAnsi" w:hAnsi="Consolas" w:cs="Consolas"/>
+          <w:color w:val="0000FF"/>
+          <w:sz w:val="19"/>
+          <w:szCs w:val="19"/>
+        </w:rPr>
+        <w:t xml:space="preserve"> /&gt;</w:t>
+      </w:r>
+    </w:p>
+    <w:p>
+      <w:pPr>
+        <w:pStyle w:val="ListParagraph"/>
+        <w:spacing w:line="240" w:lineRule="auto"/>
+        <w:rPr>
+          <w:rFonts w:ascii="Consolas" w:eastAsiaTheme="minorHAnsi" w:hAnsi="Consolas" w:cs="Consolas"/>
+          <w:color w:val="0000FF"/>
+          <w:sz w:val="19"/>
+          <w:szCs w:val="19"/>
+        </w:rPr>
+      </w:pPr>
+      <w:r>
+        <w:rPr>
+          <w:rFonts w:ascii="Consolas" w:eastAsiaTheme="minorHAnsi" w:hAnsi="Consolas" w:cs="Consolas"/>
+          <w:color w:val="0000FF"/>
+          <w:sz w:val="19"/>
+          <w:szCs w:val="19"/>
+        </w:rPr>
+        <w:t xml:space="preserve">          &lt;conditions&gt;</w:t>
+      </w:r>
+    </w:p>
+    <w:p>
+      <w:pPr>
+        <w:pStyle w:val="ListParagraph"/>
+        <w:spacing w:line="240" w:lineRule="auto"/>
+        <w:rPr>
+          <w:rFonts w:ascii="Consolas" w:eastAsiaTheme="minorHAnsi" w:hAnsi="Consolas" w:cs="Consolas"/>
+          <w:color w:val="0000FF"/>
+          <w:sz w:val="19"/>
+          <w:szCs w:val="19"/>
+        </w:rPr>
+      </w:pPr>
+      <w:r>
+        <w:rPr>
+          <w:rFonts w:ascii="Consolas" w:eastAsiaTheme="minorHAnsi" w:hAnsi="Consolas" w:cs="Consolas"/>
+          <w:color w:val="0000FF"/>
+          <w:sz w:val="19"/>
+          <w:szCs w:val="19"/>
+        </w:rPr>
+        <w:t xml:space="preserve">            &lt;add </w:t>
+      </w:r>
+      <w:r>
+        <w:rPr>
+          <w:rFonts w:ascii="Consolas" w:eastAsiaTheme="minorHAnsi" w:hAnsi="Consolas" w:cs="Consolas"/>
+          <w:color w:val="FF0000"/>
+          <w:sz w:val="19"/>
+          <w:szCs w:val="19"/>
+        </w:rPr>
+        <w:t>input</w:t>
+      </w:r>
       <w:r>
         <w:rPr>
           <w:rFonts w:ascii="Consolas" w:eastAsiaTheme="minorHAnsi" w:hAnsi="Consolas" w:cs="Consolas"/>
@@ -8986,9 +8632,26 @@
           <w:sz w:val="19"/>
           <w:szCs w:val="19"/>
         </w:rPr>
-        <w:t>(.*</w:t>
-      </w:r>
-      <w:proofErr w:type="gramEnd"/>
+        <w:t>="{HTTPS}"</w:t>
+      </w:r>
+      <w:r>
+        <w:rPr>
+          <w:rFonts w:ascii="Consolas" w:eastAsiaTheme="minorHAnsi" w:hAnsi="Consolas" w:cs="Consolas"/>
+          <w:color w:val="0000FF"/>
+          <w:sz w:val="19"/>
+          <w:szCs w:val="19"/>
+        </w:rPr>
+        <w:t xml:space="preserve"> </w:t>
+      </w:r>
+      <w:r>
+        <w:rPr>
+          <w:rFonts w:ascii="Consolas" w:eastAsiaTheme="minorHAnsi" w:hAnsi="Consolas" w:cs="Consolas"/>
+          <w:color w:val="FF0000"/>
+          <w:sz w:val="19"/>
+          <w:szCs w:val="19"/>
+        </w:rPr>
+        <w:t>pattern</w:t>
+      </w:r>
       <w:r>
         <w:rPr>
           <w:rFonts w:ascii="Consolas" w:eastAsiaTheme="minorHAnsi" w:hAnsi="Consolas" w:cs="Consolas"/>
@@ -8996,7 +8659,7 @@
           <w:sz w:val="19"/>
           <w:szCs w:val="19"/>
         </w:rPr>
-        <w:t>)"</w:t>
+        <w:t>="^OFF$"</w:t>
       </w:r>
       <w:r>
         <w:rPr>
@@ -9026,7 +8689,7 @@
           <w:sz w:val="19"/>
           <w:szCs w:val="19"/>
         </w:rPr>
-        <w:t xml:space="preserve">          &lt;conditions&gt;</w:t>
+        <w:t xml:space="preserve">          &lt;/conditions&gt;</w:t>
       </w:r>
     </w:p>
     <w:p>
@@ -9047,7 +8710,7 @@
           <w:sz w:val="19"/>
           <w:szCs w:val="19"/>
         </w:rPr>
-        <w:t xml:space="preserve">            &lt;add </w:t>
+        <w:t xml:space="preserve">          &lt;action </w:t>
       </w:r>
       <w:r>
         <w:rPr>
@@ -9056,7 +8719,7 @@
           <w:sz w:val="19"/>
           <w:szCs w:val="19"/>
         </w:rPr>
-        <w:t>input</w:t>
+        <w:t>type</w:t>
       </w:r>
       <w:r>
         <w:rPr>
@@ -9065,16 +8728,7 @@
           <w:sz w:val="19"/>
           <w:szCs w:val="19"/>
         </w:rPr>
-        <w:t>="{HTTPS}"</w:t>
-      </w:r>
-      <w:r>
-        <w:rPr>
-          <w:rFonts w:ascii="Consolas" w:eastAsiaTheme="minorHAnsi" w:hAnsi="Consolas" w:cs="Consolas"/>
-          <w:color w:val="0000FF"/>
-          <w:sz w:val="19"/>
-          <w:szCs w:val="19"/>
-        </w:rPr>
-        <w:t xml:space="preserve"> </w:t>
+        <w:t xml:space="preserve">="Redirect" </w:t>
       </w:r>
       <w:r>
         <w:rPr>
@@ -9083,7 +8737,7 @@
           <w:sz w:val="19"/>
           <w:szCs w:val="19"/>
         </w:rPr>
-        <w:t>pattern</w:t>
+        <w:t>url</w:t>
       </w:r>
       <w:r>
         <w:rPr>
@@ -9092,7 +8746,7 @@
           <w:sz w:val="19"/>
           <w:szCs w:val="19"/>
         </w:rPr>
-        <w:t>="^OFF$"</w:t>
+        <w:t>="https://{HTTP_HOST}/{R:1}"</w:t>
       </w:r>
       <w:r>
         <w:rPr>
@@ -9122,7 +8776,7 @@
           <w:sz w:val="19"/>
           <w:szCs w:val="19"/>
         </w:rPr>
-        <w:t xml:space="preserve">          &lt;/conditions&gt;</w:t>
+        <w:t xml:space="preserve">        &lt;/rule&gt;</w:t>
       </w:r>
     </w:p>
     <w:p>
@@ -9143,102 +8797,13 @@
           <w:sz w:val="19"/>
           <w:szCs w:val="19"/>
         </w:rPr>
-        <w:t xml:space="preserve">          &lt;action </w:t>
-      </w:r>
-      <w:r>
-        <w:rPr>
-          <w:rFonts w:ascii="Consolas" w:eastAsiaTheme="minorHAnsi" w:hAnsi="Consolas" w:cs="Consolas"/>
-          <w:color w:val="FF0000"/>
-          <w:sz w:val="19"/>
-          <w:szCs w:val="19"/>
-        </w:rPr>
-        <w:t>type</w:t>
-      </w:r>
-      <w:r>
-        <w:rPr>
-          <w:rFonts w:ascii="Consolas" w:eastAsiaTheme="minorHAnsi" w:hAnsi="Consolas" w:cs="Consolas"/>
-          <w:color w:val="8064A2" w:themeColor="accent4"/>
-          <w:sz w:val="19"/>
-          <w:szCs w:val="19"/>
-        </w:rPr>
-        <w:t xml:space="preserve">="Redirect" </w:t>
-      </w:r>
-      <w:proofErr w:type="spellStart"/>
-      <w:r>
-        <w:rPr>
-          <w:rFonts w:ascii="Consolas" w:eastAsiaTheme="minorHAnsi" w:hAnsi="Consolas" w:cs="Consolas"/>
-          <w:color w:val="FF0000"/>
-          <w:sz w:val="19"/>
-          <w:szCs w:val="19"/>
-        </w:rPr>
-        <w:t>url</w:t>
-      </w:r>
-      <w:proofErr w:type="spellEnd"/>
-      <w:r>
-        <w:rPr>
-          <w:rFonts w:ascii="Consolas" w:eastAsiaTheme="minorHAnsi" w:hAnsi="Consolas" w:cs="Consolas"/>
-          <w:color w:val="8064A2" w:themeColor="accent4"/>
-          <w:sz w:val="19"/>
-          <w:szCs w:val="19"/>
-        </w:rPr>
-        <w:t>="https://{HTTP_HOST}/{R:1}"</w:t>
-      </w:r>
-      <w:r>
-        <w:rPr>
-          <w:rFonts w:ascii="Consolas" w:eastAsiaTheme="minorHAnsi" w:hAnsi="Consolas" w:cs="Consolas"/>
-          <w:color w:val="0000FF"/>
-          <w:sz w:val="19"/>
-          <w:szCs w:val="19"/>
-        </w:rPr>
-        <w:t xml:space="preserve"> /&gt;</w:t>
+        <w:t xml:space="preserve">      &lt;/rules&gt;</w:t>
       </w:r>
     </w:p>
     <w:p>
       <w:pPr>
         <w:pStyle w:val="ListParagraph"/>
         <w:spacing w:line="240" w:lineRule="auto"/>
-        <w:rPr>
-          <w:rFonts w:ascii="Consolas" w:eastAsiaTheme="minorHAnsi" w:hAnsi="Consolas" w:cs="Consolas"/>
-          <w:color w:val="0000FF"/>
-          <w:sz w:val="19"/>
-          <w:szCs w:val="19"/>
-        </w:rPr>
-      </w:pPr>
-      <w:r>
-        <w:rPr>
-          <w:rFonts w:ascii="Consolas" w:eastAsiaTheme="minorHAnsi" w:hAnsi="Consolas" w:cs="Consolas"/>
-          <w:color w:val="0000FF"/>
-          <w:sz w:val="19"/>
-          <w:szCs w:val="19"/>
-        </w:rPr>
-        <w:t xml:space="preserve">        &lt;/rule&gt;</w:t>
-      </w:r>
-    </w:p>
-    <w:p>
-      <w:pPr>
-        <w:pStyle w:val="ListParagraph"/>
-        <w:spacing w:line="240" w:lineRule="auto"/>
-        <w:rPr>
-          <w:rFonts w:ascii="Consolas" w:eastAsiaTheme="minorHAnsi" w:hAnsi="Consolas" w:cs="Consolas"/>
-          <w:color w:val="0000FF"/>
-          <w:sz w:val="19"/>
-          <w:szCs w:val="19"/>
-        </w:rPr>
-      </w:pPr>
-      <w:r>
-        <w:rPr>
-          <w:rFonts w:ascii="Consolas" w:eastAsiaTheme="minorHAnsi" w:hAnsi="Consolas" w:cs="Consolas"/>
-          <w:color w:val="0000FF"/>
-          <w:sz w:val="19"/>
-          <w:szCs w:val="19"/>
-        </w:rPr>
-        <w:t xml:space="preserve">      &lt;/rules&gt;</w:t>
-      </w:r>
-    </w:p>
-    <w:p>
-      <w:pPr>
-        <w:pStyle w:val="ListParagraph"/>
-        <w:spacing w:line="240" w:lineRule="auto"/>
       </w:pPr>
       <w:r>
         <w:rPr>
@@ -9259,15 +8824,7 @@
         <w:t>Appendix E</w:t>
       </w:r>
       <w:r>
-        <w:t xml:space="preserve">: RDSB </w:t>
-      </w:r>
-      <w:proofErr w:type="spellStart"/>
-      <w:r>
-        <w:t>Web.Config</w:t>
-      </w:r>
-      <w:proofErr w:type="spellEnd"/>
-      <w:r>
-        <w:t xml:space="preserve"> Customization</w:t>
+        <w:t>: RDSB Web.Config Customization</w:t>
       </w:r>
       <w:bookmarkEnd w:id="37"/>
     </w:p>
@@ -9306,25 +8863,14 @@
         </w:numPr>
         <w:spacing w:after="0"/>
       </w:pPr>
-      <w:proofErr w:type="spellStart"/>
-      <w:r>
-        <w:rPr>
-          <w:rFonts w:ascii="Consolas" w:eastAsiaTheme="minorHAnsi" w:hAnsi="Consolas" w:cs="Consolas"/>
-          <w:color w:val="0000FF"/>
-          <w:sz w:val="19"/>
-          <w:szCs w:val="19"/>
-        </w:rPr>
-        <w:t>genTracEntities</w:t>
-      </w:r>
-      <w:proofErr w:type="spellEnd"/>
-      <w:r>
-        <w:rPr>
-          <w:rFonts w:ascii="Consolas" w:eastAsiaTheme="minorHAnsi" w:hAnsi="Consolas" w:cs="Consolas"/>
-          <w:color w:val="0000FF"/>
-          <w:sz w:val="19"/>
-          <w:szCs w:val="19"/>
-        </w:rPr>
-        <w:t xml:space="preserve"> </w:t>
+      <w:r>
+        <w:rPr>
+          <w:rFonts w:ascii="Consolas" w:eastAsiaTheme="minorHAnsi" w:hAnsi="Consolas" w:cs="Consolas"/>
+          <w:color w:val="0000FF"/>
+          <w:sz w:val="19"/>
+          <w:szCs w:val="19"/>
+        </w:rPr>
+        <w:t xml:space="preserve">genTracEntities </w:t>
       </w:r>
       <w:r>
         <w:rPr>
@@ -9354,7 +8900,6 @@
         </w:numPr>
         <w:spacing w:after="0"/>
       </w:pPr>
-      <w:proofErr w:type="spellStart"/>
       <w:r>
         <w:rPr>
           <w:rFonts w:ascii="Consolas" w:eastAsiaTheme="minorHAnsi" w:hAnsi="Consolas" w:cs="Consolas"/>
@@ -9364,7 +8909,6 @@
         </w:rPr>
         <w:t>IESEntities</w:t>
       </w:r>
-      <w:proofErr w:type="spellEnd"/>
       <w:r>
         <w:rPr>
           <w:rFonts w:ascii="Calibri" w:eastAsia="Times New Roman" w:hAnsi="Calibri" w:cs="Calibri"/>
@@ -9441,7 +8985,6 @@
           <w:rFonts w:ascii="Calibri" w:eastAsia="Times New Roman" w:hAnsi="Calibri" w:cs="Calibri"/>
         </w:rPr>
       </w:pPr>
-      <w:proofErr w:type="spellStart"/>
       <w:r>
         <w:rPr>
           <w:rFonts w:ascii="Consolas" w:eastAsiaTheme="minorHAnsi" w:hAnsi="Consolas" w:cs="Consolas"/>
@@ -9452,7 +8995,6 @@
         </w:rPr>
         <w:t>ActiveDirectoryPath</w:t>
       </w:r>
-      <w:proofErr w:type="spellEnd"/>
       <w:r>
         <w:t xml:space="preserve"> </w:t>
       </w:r>
@@ -9521,25 +9063,14 @@
           <w:rFonts w:ascii="Calibri" w:eastAsia="Times New Roman" w:hAnsi="Calibri" w:cs="Calibri"/>
         </w:rPr>
       </w:pPr>
-      <w:proofErr w:type="spellStart"/>
-      <w:r>
-        <w:rPr>
-          <w:rFonts w:ascii="Consolas" w:eastAsiaTheme="minorHAnsi" w:hAnsi="Consolas" w:cs="Consolas"/>
-          <w:color w:val="0000FF"/>
-          <w:sz w:val="19"/>
-          <w:szCs w:val="19"/>
-        </w:rPr>
-        <w:t>AuthorizeViewWhosOnlineGroups</w:t>
-      </w:r>
-      <w:proofErr w:type="spellEnd"/>
-      <w:r>
-        <w:rPr>
-          <w:rFonts w:ascii="Consolas" w:eastAsiaTheme="minorHAnsi" w:hAnsi="Consolas" w:cs="Consolas"/>
-          <w:color w:val="0000FF"/>
-          <w:sz w:val="19"/>
-          <w:szCs w:val="19"/>
-        </w:rPr>
-        <w:t xml:space="preserve"> </w:t>
+      <w:r>
+        <w:rPr>
+          <w:rFonts w:ascii="Consolas" w:eastAsiaTheme="minorHAnsi" w:hAnsi="Consolas" w:cs="Consolas"/>
+          <w:color w:val="0000FF"/>
+          <w:sz w:val="19"/>
+          <w:szCs w:val="19"/>
+        </w:rPr>
+        <w:t xml:space="preserve">AuthorizeViewWhosOnlineGroups </w:t>
       </w:r>
       <w:r>
         <w:rPr>
@@ -9567,17 +9098,47 @@
           <w:rFonts w:ascii="Calibri" w:eastAsia="Times New Roman" w:hAnsi="Calibri" w:cs="Calibri"/>
         </w:rPr>
       </w:pPr>
-      <w:proofErr w:type="spellStart"/>
-      <w:r>
-        <w:rPr>
-          <w:rFonts w:ascii="Consolas" w:eastAsiaTheme="minorHAnsi" w:hAnsi="Consolas" w:cs="Consolas"/>
-          <w:color w:val="0000FF"/>
-          <w:sz w:val="19"/>
-          <w:szCs w:val="19"/>
-        </w:rPr>
-        <w:t>IESHomeUrl</w:t>
-      </w:r>
-      <w:proofErr w:type="spellEnd"/>
+      <w:r>
+        <w:rPr>
+          <w:rFonts w:ascii="Consolas" w:eastAsiaTheme="minorHAnsi" w:hAnsi="Consolas" w:cs="Consolas"/>
+          <w:color w:val="0000FF"/>
+          <w:sz w:val="19"/>
+          <w:szCs w:val="19"/>
+        </w:rPr>
+        <w:t xml:space="preserve">IESHomeUrl </w:t>
+      </w:r>
+      <w:r>
+        <w:t xml:space="preserve">– </w:t>
+      </w:r>
+      <w:r>
+        <w:t>IES</w:t>
+      </w:r>
+      <w:r>
+        <w:t xml:space="preserve"> URL</w:t>
+      </w:r>
+    </w:p>
+    <w:p>
+      <w:pPr>
+        <w:pStyle w:val="ListParagraph"/>
+        <w:numPr>
+          <w:ilvl w:val="0"/>
+          <w:numId w:val="23"/>
+        </w:numPr>
+        <w:spacing w:after="0"/>
+        <w:textAlignment w:val="center"/>
+        <w:rPr>
+          <w:rFonts w:ascii="Calibri" w:eastAsia="Times New Roman" w:hAnsi="Calibri" w:cs="Calibri"/>
+        </w:rPr>
+      </w:pPr>
+      <w:r>
+        <w:rPr>
+          <w:rFonts w:ascii="Consolas" w:eastAsiaTheme="minorHAnsi" w:hAnsi="Consolas" w:cs="Consolas"/>
+          <w:color w:val="0000FF"/>
+          <w:sz w:val="19"/>
+          <w:szCs w:val="19"/>
+        </w:rPr>
+        <w:t>HideNonPortionMarking</w:t>
+      </w:r>
       <w:r>
         <w:rPr>
           <w:rFonts w:ascii="Consolas" w:eastAsiaTheme="minorHAnsi" w:hAnsi="Consolas" w:cs="Consolas"/>
@@ -9588,13 +9149,34 @@
         <w:t xml:space="preserve"> </w:t>
       </w:r>
       <w:r>
-        <w:t xml:space="preserve">– </w:t>
-      </w:r>
-      <w:r>
-        <w:t>IES</w:t>
-      </w:r>
-      <w:r>
-        <w:t xml:space="preserve"> URL</w:t>
+        <w:t>– set this to false, h</w:t>
+      </w:r>
+      <w:r>
+        <w:t>ide</w:t>
+      </w:r>
+      <w:r>
+        <w:t>s</w:t>
+      </w:r>
+      <w:r>
+        <w:t xml:space="preserve"> the </w:t>
+      </w:r>
+      <w:r>
+        <w:t>n</w:t>
+      </w:r>
+      <w:r>
+        <w:t>on-</w:t>
+      </w:r>
+      <w:r>
+        <w:t>p</w:t>
+      </w:r>
+      <w:r>
+        <w:t xml:space="preserve">ortion </w:t>
+      </w:r>
+      <w:r>
+        <w:t>m</w:t>
+      </w:r>
+      <w:r>
+        <w:t>arking buttons</w:t>
       </w:r>
     </w:p>
     <w:p>
@@ -9683,6 +9265,7 @@
         <w:rPr>
           <w:rFonts w:ascii="Calibri" w:eastAsia="Times New Roman" w:hAnsi="Calibri" w:cs="Calibri"/>
         </w:rPr>
+        <w:lastRenderedPageBreak/>
         <w:t>You can ignore the other piwik settings once you disable it</w:t>
       </w:r>
     </w:p>
@@ -9699,7 +9282,6 @@
           <w:rFonts w:ascii="Calibri" w:eastAsia="Times New Roman" w:hAnsi="Calibri" w:cs="Calibri"/>
         </w:rPr>
       </w:pPr>
-      <w:proofErr w:type="spellStart"/>
       <w:r>
         <w:rPr>
           <w:rFonts w:ascii="Consolas" w:eastAsiaTheme="minorHAnsi" w:hAnsi="Consolas" w:cs="Consolas"/>
@@ -9710,7 +9292,6 @@
         </w:rPr>
         <w:t>system.web</w:t>
       </w:r>
-      <w:proofErr w:type="spellEnd"/>
       <w:r>
         <w:rPr>
           <w:rFonts w:ascii="Consolas" w:eastAsiaTheme="minorHAnsi" w:hAnsi="Consolas" w:cs="Consolas"/>
@@ -9764,7 +9345,6 @@
           <w:szCs w:val="19"/>
           <w:highlight w:val="white"/>
         </w:rPr>
-        <w:lastRenderedPageBreak/>
         <w:t>allow</w:t>
       </w:r>
       <w:r>
@@ -9864,7 +9444,6 @@
         </w:rPr>
         <w:t>"</w:t>
       </w:r>
-      <w:proofErr w:type="spellStart"/>
       <w:r>
         <w:rPr>
           <w:rFonts w:ascii="Consolas" w:eastAsiaTheme="minorHAnsi" w:hAnsi="Consolas" w:cs="Consolas"/>
@@ -9875,7 +9454,6 @@
         </w:rPr>
         <w:t>elmah.axd</w:t>
       </w:r>
-      <w:proofErr w:type="spellEnd"/>
       <w:r>
         <w:rPr>
           <w:rFonts w:ascii="Consolas" w:eastAsiaTheme="minorHAnsi" w:hAnsi="Consolas" w:cs="Consolas"/>
@@ -9902,7 +9480,6 @@
         </w:rPr>
         <w:t xml:space="preserve">-&gt; </w:t>
       </w:r>
-      <w:proofErr w:type="spellStart"/>
       <w:r>
         <w:rPr>
           <w:rFonts w:ascii="Consolas" w:eastAsiaTheme="minorHAnsi" w:hAnsi="Consolas" w:cs="Consolas"/>
@@ -9913,7 +9490,6 @@
         </w:rPr>
         <w:t>system.web</w:t>
       </w:r>
-      <w:proofErr w:type="spellEnd"/>
       <w:r>
         <w:rPr>
           <w:rFonts w:ascii="Consolas" w:eastAsiaTheme="minorHAnsi" w:hAnsi="Consolas" w:cs="Consolas"/>
@@ -10210,7 +9786,6 @@
         </w:rPr>
         <w:t xml:space="preserve"> </w:t>
       </w:r>
-      <w:proofErr w:type="spellStart"/>
       <w:r>
         <w:rPr>
           <w:rFonts w:ascii="Consolas" w:eastAsiaTheme="minorHAnsi" w:hAnsi="Consolas" w:cs="Consolas"/>
@@ -10220,7 +9795,6 @@
         </w:rPr>
         <w:t>stopProcessing</w:t>
       </w:r>
-      <w:proofErr w:type="spellEnd"/>
       <w:r>
         <w:rPr>
           <w:rFonts w:ascii="Consolas" w:eastAsiaTheme="minorHAnsi" w:hAnsi="Consolas" w:cs="Consolas"/>
@@ -10278,7 +9852,6 @@
         </w:rPr>
         <w:t xml:space="preserve">          &lt;match </w:t>
       </w:r>
-      <w:proofErr w:type="spellStart"/>
       <w:r>
         <w:rPr>
           <w:rFonts w:ascii="Consolas" w:eastAsiaTheme="minorHAnsi" w:hAnsi="Consolas" w:cs="Consolas"/>
@@ -10288,7 +9861,6 @@
         </w:rPr>
         <w:t>url</w:t>
       </w:r>
-      <w:proofErr w:type="spellEnd"/>
       <w:r>
         <w:rPr>
           <w:rFonts w:ascii="Consolas" w:eastAsiaTheme="minorHAnsi" w:hAnsi="Consolas" w:cs="Consolas"/>
@@ -10296,9 +9868,68 @@
           <w:sz w:val="19"/>
           <w:szCs w:val="19"/>
         </w:rPr>
-        <w:t>="</w:t>
-      </w:r>
-      <w:proofErr w:type="gramStart"/>
+        <w:t>="(.*)"</w:t>
+      </w:r>
+      <w:r>
+        <w:rPr>
+          <w:rFonts w:ascii="Consolas" w:eastAsiaTheme="minorHAnsi" w:hAnsi="Consolas" w:cs="Consolas"/>
+          <w:color w:val="0000FF"/>
+          <w:sz w:val="19"/>
+          <w:szCs w:val="19"/>
+        </w:rPr>
+        <w:t xml:space="preserve"> /&gt;</w:t>
+      </w:r>
+    </w:p>
+    <w:p>
+      <w:pPr>
+        <w:pStyle w:val="ListParagraph"/>
+        <w:spacing w:line="240" w:lineRule="auto"/>
+        <w:rPr>
+          <w:rFonts w:ascii="Consolas" w:eastAsiaTheme="minorHAnsi" w:hAnsi="Consolas" w:cs="Consolas"/>
+          <w:color w:val="0000FF"/>
+          <w:sz w:val="19"/>
+          <w:szCs w:val="19"/>
+        </w:rPr>
+      </w:pPr>
+      <w:r>
+        <w:rPr>
+          <w:rFonts w:ascii="Consolas" w:eastAsiaTheme="minorHAnsi" w:hAnsi="Consolas" w:cs="Consolas"/>
+          <w:color w:val="0000FF"/>
+          <w:sz w:val="19"/>
+          <w:szCs w:val="19"/>
+        </w:rPr>
+        <w:t xml:space="preserve">          &lt;conditions&gt;</w:t>
+      </w:r>
+    </w:p>
+    <w:p>
+      <w:pPr>
+        <w:pStyle w:val="ListParagraph"/>
+        <w:spacing w:line="240" w:lineRule="auto"/>
+        <w:rPr>
+          <w:rFonts w:ascii="Consolas" w:eastAsiaTheme="minorHAnsi" w:hAnsi="Consolas" w:cs="Consolas"/>
+          <w:color w:val="0000FF"/>
+          <w:sz w:val="19"/>
+          <w:szCs w:val="19"/>
+        </w:rPr>
+      </w:pPr>
+      <w:r>
+        <w:rPr>
+          <w:rFonts w:ascii="Consolas" w:eastAsiaTheme="minorHAnsi" w:hAnsi="Consolas" w:cs="Consolas"/>
+          <w:color w:val="0000FF"/>
+          <w:sz w:val="19"/>
+          <w:szCs w:val="19"/>
+        </w:rPr>
+        <w:t xml:space="preserve">            &lt;add </w:t>
+      </w:r>
+      <w:r>
+        <w:rPr>
+          <w:rFonts w:ascii="Consolas" w:eastAsiaTheme="minorHAnsi" w:hAnsi="Consolas" w:cs="Consolas"/>
+          <w:color w:val="FF0000"/>
+          <w:sz w:val="19"/>
+          <w:szCs w:val="19"/>
+        </w:rPr>
+        <w:t>input</w:t>
+      </w:r>
       <w:r>
         <w:rPr>
           <w:rFonts w:ascii="Consolas" w:eastAsiaTheme="minorHAnsi" w:hAnsi="Consolas" w:cs="Consolas"/>
@@ -10306,9 +9937,26 @@
           <w:sz w:val="19"/>
           <w:szCs w:val="19"/>
         </w:rPr>
-        <w:t>(.*</w:t>
-      </w:r>
-      <w:proofErr w:type="gramEnd"/>
+        <w:t>="{HTTPS}"</w:t>
+      </w:r>
+      <w:r>
+        <w:rPr>
+          <w:rFonts w:ascii="Consolas" w:eastAsiaTheme="minorHAnsi" w:hAnsi="Consolas" w:cs="Consolas"/>
+          <w:color w:val="0000FF"/>
+          <w:sz w:val="19"/>
+          <w:szCs w:val="19"/>
+        </w:rPr>
+        <w:t xml:space="preserve"> </w:t>
+      </w:r>
+      <w:r>
+        <w:rPr>
+          <w:rFonts w:ascii="Consolas" w:eastAsiaTheme="minorHAnsi" w:hAnsi="Consolas" w:cs="Consolas"/>
+          <w:color w:val="FF0000"/>
+          <w:sz w:val="19"/>
+          <w:szCs w:val="19"/>
+        </w:rPr>
+        <w:t>pattern</w:t>
+      </w:r>
       <w:r>
         <w:rPr>
           <w:rFonts w:ascii="Consolas" w:eastAsiaTheme="minorHAnsi" w:hAnsi="Consolas" w:cs="Consolas"/>
@@ -10316,7 +9964,7 @@
           <w:sz w:val="19"/>
           <w:szCs w:val="19"/>
         </w:rPr>
-        <w:t>)"</w:t>
+        <w:t>="^OFF$"</w:t>
       </w:r>
       <w:r>
         <w:rPr>
@@ -10346,7 +9994,7 @@
           <w:sz w:val="19"/>
           <w:szCs w:val="19"/>
         </w:rPr>
-        <w:t xml:space="preserve">          &lt;conditions&gt;</w:t>
+        <w:t xml:space="preserve">          &lt;/conditions&gt;</w:t>
       </w:r>
     </w:p>
     <w:p>
@@ -10367,7 +10015,7 @@
           <w:sz w:val="19"/>
           <w:szCs w:val="19"/>
         </w:rPr>
-        <w:t xml:space="preserve">            &lt;add </w:t>
+        <w:t xml:space="preserve">          &lt;action </w:t>
       </w:r>
       <w:r>
         <w:rPr>
@@ -10376,7 +10024,7 @@
           <w:sz w:val="19"/>
           <w:szCs w:val="19"/>
         </w:rPr>
-        <w:t>input</w:t>
+        <w:t>type</w:t>
       </w:r>
       <w:r>
         <w:rPr>
@@ -10385,16 +10033,7 @@
           <w:sz w:val="19"/>
           <w:szCs w:val="19"/>
         </w:rPr>
-        <w:t>="{HTTPS}"</w:t>
-      </w:r>
-      <w:r>
-        <w:rPr>
-          <w:rFonts w:ascii="Consolas" w:eastAsiaTheme="minorHAnsi" w:hAnsi="Consolas" w:cs="Consolas"/>
-          <w:color w:val="0000FF"/>
-          <w:sz w:val="19"/>
-          <w:szCs w:val="19"/>
-        </w:rPr>
-        <w:t xml:space="preserve"> </w:t>
+        <w:t xml:space="preserve">="Redirect" </w:t>
       </w:r>
       <w:r>
         <w:rPr>
@@ -10403,7 +10042,7 @@
           <w:sz w:val="19"/>
           <w:szCs w:val="19"/>
         </w:rPr>
-        <w:t>pattern</w:t>
+        <w:t>url</w:t>
       </w:r>
       <w:r>
         <w:rPr>
@@ -10412,7 +10051,7 @@
           <w:sz w:val="19"/>
           <w:szCs w:val="19"/>
         </w:rPr>
-        <w:t>="^OFF$"</w:t>
+        <w:t>="https://{HTTP_HOST}/{R:1}"</w:t>
       </w:r>
       <w:r>
         <w:rPr>
@@ -10442,7 +10081,7 @@
           <w:sz w:val="19"/>
           <w:szCs w:val="19"/>
         </w:rPr>
-        <w:t xml:space="preserve">          &lt;/conditions&gt;</w:t>
+        <w:t xml:space="preserve">        &lt;/rule&gt;</w:t>
       </w:r>
     </w:p>
     <w:p>
@@ -10463,102 +10102,13 @@
           <w:sz w:val="19"/>
           <w:szCs w:val="19"/>
         </w:rPr>
-        <w:t xml:space="preserve">          &lt;action </w:t>
-      </w:r>
-      <w:r>
-        <w:rPr>
-          <w:rFonts w:ascii="Consolas" w:eastAsiaTheme="minorHAnsi" w:hAnsi="Consolas" w:cs="Consolas"/>
-          <w:color w:val="FF0000"/>
-          <w:sz w:val="19"/>
-          <w:szCs w:val="19"/>
-        </w:rPr>
-        <w:t>type</w:t>
-      </w:r>
-      <w:r>
-        <w:rPr>
-          <w:rFonts w:ascii="Consolas" w:eastAsiaTheme="minorHAnsi" w:hAnsi="Consolas" w:cs="Consolas"/>
-          <w:color w:val="8064A2" w:themeColor="accent4"/>
-          <w:sz w:val="19"/>
-          <w:szCs w:val="19"/>
-        </w:rPr>
-        <w:t xml:space="preserve">="Redirect" </w:t>
-      </w:r>
-      <w:proofErr w:type="spellStart"/>
-      <w:r>
-        <w:rPr>
-          <w:rFonts w:ascii="Consolas" w:eastAsiaTheme="minorHAnsi" w:hAnsi="Consolas" w:cs="Consolas"/>
-          <w:color w:val="FF0000"/>
-          <w:sz w:val="19"/>
-          <w:szCs w:val="19"/>
-        </w:rPr>
-        <w:t>url</w:t>
-      </w:r>
-      <w:proofErr w:type="spellEnd"/>
-      <w:r>
-        <w:rPr>
-          <w:rFonts w:ascii="Consolas" w:eastAsiaTheme="minorHAnsi" w:hAnsi="Consolas" w:cs="Consolas"/>
-          <w:color w:val="8064A2" w:themeColor="accent4"/>
-          <w:sz w:val="19"/>
-          <w:szCs w:val="19"/>
-        </w:rPr>
-        <w:t>="https://{HTTP_HOST}/{R:1}"</w:t>
-      </w:r>
-      <w:r>
-        <w:rPr>
-          <w:rFonts w:ascii="Consolas" w:eastAsiaTheme="minorHAnsi" w:hAnsi="Consolas" w:cs="Consolas"/>
-          <w:color w:val="0000FF"/>
-          <w:sz w:val="19"/>
-          <w:szCs w:val="19"/>
-        </w:rPr>
-        <w:t xml:space="preserve"> /&gt;</w:t>
+        <w:t xml:space="preserve">      &lt;/rules&gt;</w:t>
       </w:r>
     </w:p>
     <w:p>
       <w:pPr>
         <w:pStyle w:val="ListParagraph"/>
         <w:spacing w:line="240" w:lineRule="auto"/>
-        <w:rPr>
-          <w:rFonts w:ascii="Consolas" w:eastAsiaTheme="minorHAnsi" w:hAnsi="Consolas" w:cs="Consolas"/>
-          <w:color w:val="0000FF"/>
-          <w:sz w:val="19"/>
-          <w:szCs w:val="19"/>
-        </w:rPr>
-      </w:pPr>
-      <w:r>
-        <w:rPr>
-          <w:rFonts w:ascii="Consolas" w:eastAsiaTheme="minorHAnsi" w:hAnsi="Consolas" w:cs="Consolas"/>
-          <w:color w:val="0000FF"/>
-          <w:sz w:val="19"/>
-          <w:szCs w:val="19"/>
-        </w:rPr>
-        <w:t xml:space="preserve">        &lt;/rule&gt;</w:t>
-      </w:r>
-    </w:p>
-    <w:p>
-      <w:pPr>
-        <w:pStyle w:val="ListParagraph"/>
-        <w:spacing w:line="240" w:lineRule="auto"/>
-        <w:rPr>
-          <w:rFonts w:ascii="Consolas" w:eastAsiaTheme="minorHAnsi" w:hAnsi="Consolas" w:cs="Consolas"/>
-          <w:color w:val="0000FF"/>
-          <w:sz w:val="19"/>
-          <w:szCs w:val="19"/>
-        </w:rPr>
-      </w:pPr>
-      <w:r>
-        <w:rPr>
-          <w:rFonts w:ascii="Consolas" w:eastAsiaTheme="minorHAnsi" w:hAnsi="Consolas" w:cs="Consolas"/>
-          <w:color w:val="0000FF"/>
-          <w:sz w:val="19"/>
-          <w:szCs w:val="19"/>
-        </w:rPr>
-        <w:t xml:space="preserve">      &lt;/rules&gt;</w:t>
-      </w:r>
-    </w:p>
-    <w:p>
-      <w:pPr>
-        <w:pStyle w:val="ListParagraph"/>
-        <w:spacing w:line="240" w:lineRule="auto"/>
       </w:pPr>
       <w:r>
         <w:rPr>
@@ -10587,13 +10137,8 @@
       <w:r>
         <w:t xml:space="preserve">Emailer - </w:t>
       </w:r>
-      <w:proofErr w:type="spellStart"/>
-      <w:r>
-        <w:t>App.Config</w:t>
-      </w:r>
-      <w:proofErr w:type="spellEnd"/>
-      <w:r>
-        <w:t xml:space="preserve"> Customization</w:t>
+      <w:r>
+        <w:t>App.Config Customization</w:t>
       </w:r>
       <w:bookmarkEnd w:id="38"/>
     </w:p>
@@ -10632,25 +10177,14 @@
         </w:numPr>
         <w:spacing w:after="0"/>
       </w:pPr>
-      <w:proofErr w:type="spellStart"/>
-      <w:r>
-        <w:rPr>
-          <w:rFonts w:ascii="Consolas" w:eastAsiaTheme="minorHAnsi" w:hAnsi="Consolas" w:cs="Consolas"/>
-          <w:color w:val="0000FF"/>
-          <w:sz w:val="19"/>
-          <w:szCs w:val="19"/>
-        </w:rPr>
-        <w:t>genTracEntities</w:t>
-      </w:r>
-      <w:proofErr w:type="spellEnd"/>
-      <w:r>
-        <w:rPr>
-          <w:rFonts w:ascii="Consolas" w:eastAsiaTheme="minorHAnsi" w:hAnsi="Consolas" w:cs="Consolas"/>
-          <w:color w:val="0000FF"/>
-          <w:sz w:val="19"/>
-          <w:szCs w:val="19"/>
-        </w:rPr>
-        <w:t xml:space="preserve"> </w:t>
+      <w:r>
+        <w:rPr>
+          <w:rFonts w:ascii="Consolas" w:eastAsiaTheme="minorHAnsi" w:hAnsi="Consolas" w:cs="Consolas"/>
+          <w:color w:val="0000FF"/>
+          <w:sz w:val="19"/>
+          <w:szCs w:val="19"/>
+        </w:rPr>
+        <w:t xml:space="preserve">genTracEntities </w:t>
       </w:r>
       <w:r>
         <w:rPr>
@@ -10715,7 +10249,6 @@
           <w:rFonts w:ascii="Calibri" w:eastAsia="Times New Roman" w:hAnsi="Calibri" w:cs="Calibri"/>
         </w:rPr>
       </w:pPr>
-      <w:proofErr w:type="spellStart"/>
       <w:r>
         <w:rPr>
           <w:rFonts w:ascii="Consolas" w:eastAsiaTheme="minorHAnsi" w:hAnsi="Consolas" w:cs="Consolas"/>
@@ -10726,7 +10259,6 @@
         </w:rPr>
         <w:t>EmailServer</w:t>
       </w:r>
-      <w:proofErr w:type="spellEnd"/>
       <w:r>
         <w:t xml:space="preserve"> </w:t>
       </w:r>
@@ -10749,7 +10281,6 @@
           <w:rFonts w:ascii="Calibri" w:eastAsia="Times New Roman" w:hAnsi="Calibri" w:cs="Calibri"/>
         </w:rPr>
       </w:pPr>
-      <w:proofErr w:type="spellStart"/>
       <w:r>
         <w:rPr>
           <w:rFonts w:ascii="Consolas" w:eastAsiaTheme="minorHAnsi" w:hAnsi="Consolas" w:cs="Consolas"/>
@@ -10760,7 +10291,6 @@
         </w:rPr>
         <w:t>ServerURL</w:t>
       </w:r>
-      <w:proofErr w:type="spellEnd"/>
       <w:r>
         <w:rPr>
           <w:rFonts w:eastAsiaTheme="minorHAnsi" w:cs="Consolas"/>
@@ -10781,7 +10311,6 @@
         </w:numPr>
         <w:spacing w:after="0"/>
       </w:pPr>
-      <w:proofErr w:type="spellStart"/>
       <w:r>
         <w:rPr>
           <w:rFonts w:ascii="Consolas" w:eastAsiaTheme="minorHAnsi" w:hAnsi="Consolas" w:cs="Consolas"/>
@@ -10792,7 +10321,6 @@
         </w:rPr>
         <w:t>HelpdeskEmailAddress</w:t>
       </w:r>
-      <w:proofErr w:type="spellEnd"/>
       <w:r>
         <w:t xml:space="preserve"> – email displayed to the users to contact for help</w:t>
       </w:r>
@@ -10894,15 +10422,7 @@
       </w:pPr>
       <w:bookmarkStart w:id="39" w:name="_Toc4596588"/>
       <w:r>
-        <w:t xml:space="preserve">Appendix G: RDM Data Replication - </w:t>
-      </w:r>
-      <w:proofErr w:type="spellStart"/>
-      <w:r>
-        <w:t>App.Config</w:t>
-      </w:r>
-      <w:proofErr w:type="spellEnd"/>
-      <w:r>
-        <w:t xml:space="preserve"> Customization</w:t>
+        <w:t>Appendix G: RDM Data Replication - App.Config Customization</w:t>
       </w:r>
       <w:bookmarkEnd w:id="39"/>
     </w:p>
@@ -10941,7 +10461,6 @@
         </w:numPr>
         <w:spacing w:after="0"/>
       </w:pPr>
-      <w:proofErr w:type="spellStart"/>
       <w:r>
         <w:rPr>
           <w:rFonts w:ascii="Consolas" w:eastAsiaTheme="minorHAnsi" w:hAnsi="Consolas" w:cs="Consolas"/>
@@ -10951,7 +10470,6 @@
         </w:rPr>
         <w:t>IESEntities</w:t>
       </w:r>
-      <w:proofErr w:type="spellEnd"/>
       <w:r>
         <w:rPr>
           <w:rFonts w:ascii="Consolas" w:eastAsiaTheme="minorHAnsi" w:hAnsi="Consolas" w:cs="Consolas"/>
@@ -11024,7 +10542,6 @@
           <w:rFonts w:ascii="Calibri" w:eastAsia="Times New Roman" w:hAnsi="Calibri" w:cs="Calibri"/>
         </w:rPr>
       </w:pPr>
-      <w:proofErr w:type="spellStart"/>
       <w:r>
         <w:rPr>
           <w:rFonts w:ascii="Consolas" w:eastAsiaTheme="minorHAnsi" w:hAnsi="Consolas" w:cs="Consolas"/>
@@ -11035,7 +10552,6 @@
         </w:rPr>
         <w:t>EmailServer</w:t>
       </w:r>
-      <w:proofErr w:type="spellEnd"/>
       <w:r>
         <w:t xml:space="preserve"> </w:t>
       </w:r>
@@ -11058,25 +10574,14 @@
           <w:rFonts w:ascii="Calibri" w:eastAsia="Times New Roman" w:hAnsi="Calibri" w:cs="Calibri"/>
         </w:rPr>
       </w:pPr>
-      <w:proofErr w:type="spellStart"/>
-      <w:r>
-        <w:rPr>
-          <w:rFonts w:ascii="Consolas" w:eastAsiaTheme="minorHAnsi" w:hAnsi="Consolas" w:cs="Consolas"/>
-          <w:color w:val="0000FF"/>
-          <w:sz w:val="19"/>
-          <w:szCs w:val="19"/>
-        </w:rPr>
-        <w:t>EmailDistributionList</w:t>
-      </w:r>
-      <w:proofErr w:type="spellEnd"/>
-      <w:r>
-        <w:rPr>
-          <w:rFonts w:ascii="Consolas" w:eastAsiaTheme="minorHAnsi" w:hAnsi="Consolas" w:cs="Consolas"/>
-          <w:color w:val="0000FF"/>
-          <w:sz w:val="19"/>
-          <w:szCs w:val="19"/>
-        </w:rPr>
-        <w:t xml:space="preserve"> </w:t>
+      <w:r>
+        <w:rPr>
+          <w:rFonts w:ascii="Consolas" w:eastAsiaTheme="minorHAnsi" w:hAnsi="Consolas" w:cs="Consolas"/>
+          <w:color w:val="0000FF"/>
+          <w:sz w:val="19"/>
+          <w:szCs w:val="19"/>
+        </w:rPr>
+        <w:t xml:space="preserve">EmailDistributionList </w:t>
       </w:r>
       <w:r>
         <w:rPr>
@@ -11100,7 +10605,6 @@
         </w:numPr>
         <w:spacing w:after="0"/>
       </w:pPr>
-      <w:proofErr w:type="spellStart"/>
       <w:r>
         <w:rPr>
           <w:rFonts w:ascii="Consolas" w:eastAsiaTheme="minorHAnsi" w:hAnsi="Consolas" w:cs="Consolas"/>
@@ -11111,7 +10615,6 @@
         </w:rPr>
         <w:t>HelpdeskEmailAddress</w:t>
       </w:r>
-      <w:proofErr w:type="spellEnd"/>
       <w:r>
         <w:t xml:space="preserve"> – email displayed to the users to contact for help</w:t>
       </w:r>
@@ -11125,17 +10628,16 @@
         </w:numPr>
         <w:spacing w:after="0"/>
       </w:pPr>
-      <w:proofErr w:type="spellStart"/>
-      <w:r>
-        <w:rPr>
-          <w:rFonts w:ascii="Consolas" w:eastAsiaTheme="minorHAnsi" w:hAnsi="Consolas" w:cs="Consolas"/>
-          <w:color w:val="0000FF"/>
-          <w:sz w:val="19"/>
-          <w:szCs w:val="19"/>
-        </w:rPr>
+      <w:r>
+        <w:rPr>
+          <w:rFonts w:ascii="Consolas" w:eastAsiaTheme="minorHAnsi" w:hAnsi="Consolas" w:cs="Consolas"/>
+          <w:color w:val="0000FF"/>
+          <w:sz w:val="19"/>
+          <w:szCs w:val="19"/>
+        </w:rPr>
+        <w:lastRenderedPageBreak/>
         <w:t>RdmSearchFolder</w:t>
       </w:r>
-      <w:proofErr w:type="spellEnd"/>
       <w:r>
         <w:t xml:space="preserve"> – the account has to have full access to this folder; the folder has to exist ahead of time; this is where the security will place files once they are moved from unclassified location; </w:t>
       </w:r>
@@ -11149,18 +10651,15 @@
         </w:numPr>
         <w:spacing w:after="0"/>
       </w:pPr>
-      <w:proofErr w:type="spellStart"/>
-      <w:r>
-        <w:rPr>
-          <w:rFonts w:ascii="Consolas" w:eastAsiaTheme="minorHAnsi" w:hAnsi="Consolas" w:cs="Consolas"/>
-          <w:color w:val="0000FF"/>
-          <w:sz w:val="19"/>
-          <w:szCs w:val="19"/>
-        </w:rPr>
-        <w:lastRenderedPageBreak/>
+      <w:r>
+        <w:rPr>
+          <w:rFonts w:ascii="Consolas" w:eastAsiaTheme="minorHAnsi" w:hAnsi="Consolas" w:cs="Consolas"/>
+          <w:color w:val="0000FF"/>
+          <w:sz w:val="19"/>
+          <w:szCs w:val="19"/>
+        </w:rPr>
         <w:t>RdmArchiveFolder</w:t>
       </w:r>
-      <w:proofErr w:type="spellEnd"/>
       <w:r>
         <w:t xml:space="preserve"> – the account has to have full access to this folder; the folder has to exist ahead of time; suggested location would be an “Archive” folder in the folder above</w:t>
       </w:r>
@@ -11177,36 +10676,17 @@
           <w:sz w:val="20"/>
         </w:rPr>
       </w:pPr>
-      <w:proofErr w:type="spellStart"/>
-      <w:r>
-        <w:rPr>
-          <w:rFonts w:ascii="Consolas" w:eastAsiaTheme="minorHAnsi" w:hAnsi="Consolas" w:cs="Consolas"/>
-          <w:color w:val="0000FF"/>
-          <w:sz w:val="19"/>
-          <w:szCs w:val="19"/>
-        </w:rPr>
-        <w:t>RdmClearRevisionCacheUrl</w:t>
-      </w:r>
-      <w:proofErr w:type="spellEnd"/>
-      <w:r>
-        <w:rPr>
-          <w:rFonts w:ascii="Consolas" w:eastAsiaTheme="minorHAnsi" w:hAnsi="Consolas" w:cs="Consolas"/>
-          <w:color w:val="0000FF"/>
-          <w:sz w:val="19"/>
-          <w:szCs w:val="19"/>
-        </w:rPr>
-        <w:t xml:space="preserve"> </w:t>
-      </w:r>
-      <w:r>
-        <w:t xml:space="preserve">– URL of the RDM application, pointing to a specific view; pattern of what it needs to be set to (where </w:t>
-      </w:r>
-      <w:proofErr w:type="spellStart"/>
-      <w:r>
-        <w:t>RdmURL</w:t>
-      </w:r>
-      <w:proofErr w:type="spellEnd"/>
-      <w:r>
-        <w:t xml:space="preserve"> represents the URL of the application) is : </w:t>
+      <w:r>
+        <w:rPr>
+          <w:rFonts w:ascii="Consolas" w:eastAsiaTheme="minorHAnsi" w:hAnsi="Consolas" w:cs="Consolas"/>
+          <w:color w:val="0000FF"/>
+          <w:sz w:val="19"/>
+          <w:szCs w:val="19"/>
+        </w:rPr>
+        <w:t xml:space="preserve">RdmClearRevisionCacheUrl </w:t>
+      </w:r>
+      <w:r>
+        <w:t xml:space="preserve">– URL of the RDM application, pointing to a specific view; pattern of what it needs to be set to (where RdmURL represents the URL of the application) is : </w:t>
       </w:r>
       <w:r>
         <w:rPr>
@@ -11216,7 +10696,6 @@
         </w:rPr>
         <w:t>http(s)://</w:t>
       </w:r>
-      <w:proofErr w:type="spellStart"/>
       <w:r>
         <w:rPr>
           <w:rFonts w:ascii="Consolas" w:hAnsi="Consolas"/>
@@ -11226,25 +10705,14 @@
         </w:rPr>
         <w:t>RdmURL</w:t>
       </w:r>
-      <w:proofErr w:type="spellEnd"/>
       <w:r>
         <w:rPr>
           <w:rFonts w:ascii="Consolas" w:hAnsi="Consolas"/>
           <w:color w:val="984806" w:themeColor="accent6" w:themeShade="80"/>
           <w:sz w:val="18"/>
         </w:rPr>
-        <w:t>/Admin/</w:t>
-      </w:r>
-      <w:proofErr w:type="spellStart"/>
-      <w:r>
-        <w:rPr>
-          <w:rFonts w:ascii="Consolas" w:hAnsi="Consolas"/>
-          <w:color w:val="984806" w:themeColor="accent6" w:themeShade="80"/>
-          <w:sz w:val="18"/>
-        </w:rPr>
-        <w:t>ClearRevisionCache</w:t>
-      </w:r>
-      <w:proofErr w:type="spellEnd"/>
+        <w:t>/Admin/ClearRevisionCache</w:t>
+      </w:r>
       <w:r>
         <w:rPr>
           <w:sz w:val="20"/>
@@ -11359,15 +10827,7 @@
       </w:pPr>
       <w:bookmarkStart w:id="40" w:name="_Toc4596589"/>
       <w:r>
-        <w:t xml:space="preserve">Appendix H: GenBOE Auto Backup - </w:t>
-      </w:r>
-      <w:proofErr w:type="spellStart"/>
-      <w:r>
-        <w:t>App.Config</w:t>
-      </w:r>
-      <w:proofErr w:type="spellEnd"/>
-      <w:r>
-        <w:t xml:space="preserve"> Customization</w:t>
+        <w:t>Appendix H: GenBOE Auto Backup - App.Config Customization</w:t>
       </w:r>
       <w:bookmarkEnd w:id="40"/>
     </w:p>
@@ -11406,25 +10866,14 @@
         </w:numPr>
         <w:spacing w:after="0"/>
       </w:pPr>
-      <w:proofErr w:type="spellStart"/>
-      <w:r>
-        <w:rPr>
-          <w:rFonts w:ascii="Consolas" w:eastAsiaTheme="minorHAnsi" w:hAnsi="Consolas" w:cs="Consolas"/>
-          <w:color w:val="0000FF"/>
-          <w:sz w:val="19"/>
-          <w:szCs w:val="19"/>
-        </w:rPr>
-        <w:t>GenBoeEntities</w:t>
-      </w:r>
-      <w:proofErr w:type="spellEnd"/>
-      <w:r>
-        <w:rPr>
-          <w:rFonts w:ascii="Consolas" w:eastAsiaTheme="minorHAnsi" w:hAnsi="Consolas" w:cs="Consolas"/>
-          <w:color w:val="0000FF"/>
-          <w:sz w:val="19"/>
-          <w:szCs w:val="19"/>
-        </w:rPr>
-        <w:t xml:space="preserve"> </w:t>
+      <w:r>
+        <w:rPr>
+          <w:rFonts w:ascii="Consolas" w:eastAsiaTheme="minorHAnsi" w:hAnsi="Consolas" w:cs="Consolas"/>
+          <w:color w:val="0000FF"/>
+          <w:sz w:val="19"/>
+          <w:szCs w:val="19"/>
+        </w:rPr>
+        <w:t xml:space="preserve">GenBoeEntities </w:t>
       </w:r>
       <w:r>
         <w:rPr>
@@ -11495,7 +10944,6 @@
           <w:rFonts w:ascii="Calibri" w:eastAsia="Times New Roman" w:hAnsi="Calibri" w:cs="Calibri"/>
         </w:rPr>
       </w:pPr>
-      <w:proofErr w:type="spellStart"/>
       <w:r>
         <w:rPr>
           <w:rFonts w:ascii="Consolas" w:eastAsiaTheme="minorHAnsi" w:hAnsi="Consolas" w:cs="Consolas"/>
@@ -11506,7 +10954,6 @@
         </w:rPr>
         <w:t>EmailServer</w:t>
       </w:r>
-      <w:proofErr w:type="spellEnd"/>
       <w:r>
         <w:t xml:space="preserve"> </w:t>
       </w:r>
@@ -11529,25 +10976,14 @@
           <w:rFonts w:ascii="Calibri" w:eastAsia="Times New Roman" w:hAnsi="Calibri" w:cs="Calibri"/>
         </w:rPr>
       </w:pPr>
-      <w:proofErr w:type="spellStart"/>
-      <w:r>
-        <w:rPr>
-          <w:rFonts w:ascii="Consolas" w:eastAsiaTheme="minorHAnsi" w:hAnsi="Consolas" w:cs="Consolas"/>
-          <w:color w:val="0000FF"/>
-          <w:sz w:val="19"/>
-          <w:szCs w:val="19"/>
-        </w:rPr>
-        <w:t>SendEmailTo</w:t>
-      </w:r>
-      <w:proofErr w:type="spellEnd"/>
-      <w:r>
-        <w:rPr>
-          <w:rFonts w:ascii="Consolas" w:eastAsiaTheme="minorHAnsi" w:hAnsi="Consolas" w:cs="Consolas"/>
-          <w:color w:val="0000FF"/>
-          <w:sz w:val="19"/>
-          <w:szCs w:val="19"/>
-        </w:rPr>
-        <w:t xml:space="preserve"> </w:t>
+      <w:r>
+        <w:rPr>
+          <w:rFonts w:ascii="Consolas" w:eastAsiaTheme="minorHAnsi" w:hAnsi="Consolas" w:cs="Consolas"/>
+          <w:color w:val="0000FF"/>
+          <w:sz w:val="19"/>
+          <w:szCs w:val="19"/>
+        </w:rPr>
+        <w:t xml:space="preserve">SendEmailTo </w:t>
       </w:r>
       <w:r>
         <w:rPr>
@@ -11571,7 +11007,6 @@
         </w:numPr>
         <w:spacing w:after="0"/>
       </w:pPr>
-      <w:proofErr w:type="spellStart"/>
       <w:r>
         <w:rPr>
           <w:rFonts w:ascii="Consolas" w:eastAsiaTheme="minorHAnsi" w:hAnsi="Consolas" w:cs="Consolas"/>
@@ -11582,7 +11017,6 @@
         </w:rPr>
         <w:t>HelpdeskEmailAddress</w:t>
       </w:r>
-      <w:proofErr w:type="spellEnd"/>
       <w:r>
         <w:t xml:space="preserve"> – email displayed to the users to contact for help</w:t>
       </w:r>
@@ -11814,7 +11248,6 @@
               <v:path gradientshapeok="t" o:connecttype="rect"/>
             </v:shapetype>
             <v:shape id="Text Box 9" o:spid="_x0000_s1028" type="#_x0000_t202" alt="Lockheed Martin Proprietary Information" style="position:absolute;left:0;text-align:left;margin-left:0;margin-top:.05pt;width:34.95pt;height:34.95pt;z-index:251662336;visibility:visible;mso-wrap-style:none;mso-wrap-distance-left:0;mso-wrap-distance-top:0;mso-wrap-distance-right:0;mso-wrap-distance-bottom:0;mso-position-horizontal:center;mso-position-horizontal-relative:text;mso-position-vertical:absolute;mso-position-vertical-relative:text;v-text-anchor:top" o:gfxdata="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" filled="f" stroked="f">
-              <v:fill o:detectmouseclick="t"/>
               <v:textbox style="mso-fit-shape-to-text:t" inset="0,0,0,0">
                 <w:txbxContent>
                   <w:p>
@@ -11952,7 +11385,6 @@
               <v:path gradientshapeok="t" o:connecttype="rect"/>
             </v:shapetype>
             <v:shape id="Text Box 10" o:spid="_x0000_s1029" type="#_x0000_t202" alt="Lockheed Martin Proprietary Information" style="position:absolute;left:0;text-align:left;margin-left:0;margin-top:.05pt;width:34.95pt;height:34.95pt;z-index:251663360;visibility:visible;mso-wrap-style:none;mso-wrap-distance-left:0;mso-wrap-distance-top:0;mso-wrap-distance-right:0;mso-wrap-distance-bottom:0;mso-position-horizontal:center;mso-position-horizontal-relative:text;mso-position-vertical:absolute;mso-position-vertical-relative:text;v-text-anchor:top" o:gfxdata="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" filled="f" stroked="f">
-              <v:fill o:detectmouseclick="t"/>
               <v:textbox style="mso-fit-shape-to-text:t" inset="0,0,0,0">
                 <w:txbxContent>
                   <w:p>
@@ -12090,7 +11522,6 @@
               <v:path gradientshapeok="t" o:connecttype="rect"/>
             </v:shapetype>
             <v:shape id="Text Box 8" o:spid="_x0000_s1031" type="#_x0000_t202" alt="Lockheed Martin Proprietary Information" style="position:absolute;left:0;text-align:left;margin-left:0;margin-top:.05pt;width:34.95pt;height:34.95pt;z-index:251661312;visibility:visible;mso-wrap-style:none;mso-wrap-distance-left:0;mso-wrap-distance-top:0;mso-wrap-distance-right:0;mso-wrap-distance-bottom:0;mso-position-horizontal:center;mso-position-horizontal-relative:text;mso-position-vertical:absolute;mso-position-vertical-relative:text;v-text-anchor:top" o:gfxdata="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" filled="f" stroked="f">
-              <v:fill o:detectmouseclick="t"/>
               <v:textbox style="mso-fit-shape-to-text:t" inset="0,0,0,0">
                 <w:txbxContent>
                   <w:p>
@@ -12437,7 +11868,6 @@
               <v:path gradientshapeok="t" o:connecttype="rect"/>
             </v:shapetype>
             <v:shape id="Text Box 6" o:spid="_x0000_s1026" type="#_x0000_t202" alt="Lockheed Martin Proprietary Information" style="position:absolute;left:0;text-align:left;margin-left:0;margin-top:.05pt;width:34.95pt;height:34.95pt;z-index:251659264;visibility:visible;mso-wrap-style:none;mso-wrap-distance-left:0;mso-wrap-distance-top:0;mso-wrap-distance-right:0;mso-wrap-distance-bottom:0;mso-position-horizontal:center;mso-position-horizontal-relative:text;mso-position-vertical:absolute;mso-position-vertical-relative:text;v-text-anchor:top" o:gfxdata="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" filled="f" stroked="f">
-              <v:fill o:detectmouseclick="t"/>
               <v:textbox style="mso-fit-shape-to-text:t" inset="0,0,0,0">
                 <w:txbxContent>
                   <w:p>
@@ -12575,7 +12005,6 @@
               <v:path gradientshapeok="t" o:connecttype="rect"/>
             </v:shapetype>
             <v:shape id="Text Box 7" o:spid="_x0000_s1027" type="#_x0000_t202" alt="Lockheed Martin Proprietary Information" style="position:absolute;left:0;text-align:left;margin-left:0;margin-top:.05pt;width:34.95pt;height:34.95pt;z-index:251660288;visibility:visible;mso-wrap-style:none;mso-wrap-distance-left:0;mso-wrap-distance-top:0;mso-wrap-distance-right:0;mso-wrap-distance-bottom:0;mso-position-horizontal:center;mso-position-horizontal-relative:text;mso-position-vertical:absolute;mso-position-vertical-relative:text;v-text-anchor:top" o:gfxdata="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" filled="f" stroked="f">
-              <v:fill o:detectmouseclick="t"/>
               <v:textbox style="mso-fit-shape-to-text:t" inset="0,0,0,0">
                 <w:txbxContent>
                   <w:p>
@@ -12713,7 +12142,6 @@
               <v:path gradientshapeok="t" o:connecttype="rect"/>
             </v:shapetype>
             <v:shape id="Text Box 5" o:spid="_x0000_s1030" type="#_x0000_t202" alt="Lockheed Martin Proprietary Information" style="position:absolute;left:0;text-align:left;margin-left:0;margin-top:.05pt;width:34.95pt;height:34.95pt;z-index:251658240;visibility:visible;mso-wrap-style:none;mso-wrap-distance-left:0;mso-wrap-distance-top:0;mso-wrap-distance-right:0;mso-wrap-distance-bottom:0;mso-position-horizontal:center;mso-position-horizontal-relative:text;mso-position-vertical:absolute;mso-position-vertical-relative:text;v-text-anchor:top" o:gfxdata="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" filled="f" stroked="f">
-              <v:fill o:detectmouseclick="t"/>
               <v:textbox style="mso-fit-shape-to-text:t" inset="0,0,0,0">
                 <w:txbxContent>
                   <w:p>
@@ -14217,7 +13645,7 @@
         <w:ind w:left="1440" w:hanging="360"/>
       </w:pPr>
     </w:lvl>
-    <w:lvl w:ilvl="1" w:tplc="04090019" w:tentative="1">
+    <w:lvl w:ilvl="1" w:tplc="04090019">
       <w:start w:val="1"/>
       <w:numFmt w:val="lowerLetter"/>
       <w:lvlText w:val="%2."/>
@@ -15758,6 +15186,7 @@
     <w:lsdException w:name="HTML Sample" w:semiHidden="1" w:unhideWhenUsed="1"/>
     <w:lsdException w:name="HTML Typewriter" w:semiHidden="1" w:unhideWhenUsed="1"/>
     <w:lsdException w:name="HTML Variable" w:semiHidden="1" w:unhideWhenUsed="1"/>
+    <w:lsdException w:name="Normal Table" w:semiHidden="1" w:unhideWhenUsed="1"/>
     <w:lsdException w:name="annotation subject" w:semiHidden="1" w:unhideWhenUsed="1"/>
     <w:lsdException w:name="No List" w:semiHidden="1" w:unhideWhenUsed="1"/>
     <w:lsdException w:name="Outline List 1" w:semiHidden="1" w:unhideWhenUsed="1"/>
@@ -15800,8 +15229,11 @@
     <w:lsdException w:name="Table Contemporary" w:semiHidden="1" w:unhideWhenUsed="1"/>
     <w:lsdException w:name="Table Elegant" w:semiHidden="1" w:unhideWhenUsed="1"/>
     <w:lsdException w:name="Table Professional" w:semiHidden="1" w:unhideWhenUsed="1"/>
+    <w:lsdException w:name="Table Subtle 1" w:semiHidden="1" w:unhideWhenUsed="1"/>
     <w:lsdException w:name="Table Subtle 2" w:semiHidden="1" w:unhideWhenUsed="1"/>
     <w:lsdException w:name="Table Web 1" w:semiHidden="1" w:unhideWhenUsed="1"/>
+    <w:lsdException w:name="Table Web 2" w:semiHidden="1" w:unhideWhenUsed="1"/>
+    <w:lsdException w:name="Table Web 3" w:semiHidden="1" w:unhideWhenUsed="1"/>
     <w:lsdException w:name="Balloon Text" w:semiHidden="1" w:unhideWhenUsed="1"/>
     <w:lsdException w:name="Table Grid" w:uiPriority="59"/>
     <w:lsdException w:name="Table Theme" w:semiHidden="1" w:unhideWhenUsed="1"/>

</xml_diff>

<commit_message>
added additional feature flag, updated classified install instructions, removed unnecessary file and code
</commit_message>
<xml_diff>
--- a/ClassifiedInstallationStuff/_Instructions/Initial IES Suite Installation Instuctions.docx
+++ b/ClassifiedInstallationStuff/_Instructions/Initial IES Suite Installation Instuctions.docx
@@ -37,17 +37,17 @@
         </w:rPr>
       </w:pPr>
     </w:p>
-    <w:bookmarkStart w:id="0" w:name="_Toc515460341" w:displacedByCustomXml="next"/>
-    <w:bookmarkStart w:id="1" w:name="_Toc435089160" w:displacedByCustomXml="next"/>
-    <w:bookmarkStart w:id="2" w:name="_Toc402261032" w:displacedByCustomXml="next"/>
-    <w:bookmarkStart w:id="3" w:name="_Toc409096411" w:displacedByCustomXml="next"/>
-    <w:bookmarkStart w:id="4" w:name="_Toc410226779" w:displacedByCustomXml="next"/>
+    <w:bookmarkStart w:id="0" w:name="_Toc4596569" w:displacedByCustomXml="next"/>
+    <w:bookmarkStart w:id="1" w:name="_Toc426545466" w:displacedByCustomXml="next"/>
+    <w:bookmarkStart w:id="2" w:name="_Toc426545102" w:displacedByCustomXml="next"/>
+    <w:bookmarkStart w:id="3" w:name="_Toc426544400" w:displacedByCustomXml="next"/>
+    <w:bookmarkStart w:id="4" w:name="_Toc410652409" w:displacedByCustomXml="next"/>
     <w:bookmarkStart w:id="5" w:name="_Toc410286731" w:displacedByCustomXml="next"/>
-    <w:bookmarkStart w:id="6" w:name="_Toc410652409" w:displacedByCustomXml="next"/>
-    <w:bookmarkStart w:id="7" w:name="_Toc426544400" w:displacedByCustomXml="next"/>
-    <w:bookmarkStart w:id="8" w:name="_Toc426545102" w:displacedByCustomXml="next"/>
-    <w:bookmarkStart w:id="9" w:name="_Toc426545466" w:displacedByCustomXml="next"/>
-    <w:bookmarkStart w:id="10" w:name="_Toc4596569" w:displacedByCustomXml="next"/>
+    <w:bookmarkStart w:id="6" w:name="_Toc410226779" w:displacedByCustomXml="next"/>
+    <w:bookmarkStart w:id="7" w:name="_Toc409096411" w:displacedByCustomXml="next"/>
+    <w:bookmarkStart w:id="8" w:name="_Toc402261032" w:displacedByCustomXml="next"/>
+    <w:bookmarkStart w:id="9" w:name="_Toc435089160" w:displacedByCustomXml="next"/>
+    <w:bookmarkStart w:id="10" w:name="_Toc515460341" w:displacedByCustomXml="next"/>
     <w:sdt>
       <w:sdtPr>
         <w:rPr>
@@ -75,8 +75,8 @@
         </w:rPr>
       </w:sdtEndPr>
       <w:sdtContent>
-        <w:bookmarkStart w:id="11" w:name="_Toc320016168" w:displacedByCustomXml="prev"/>
-        <w:bookmarkStart w:id="12" w:name="_Toc266280202" w:displacedByCustomXml="prev"/>
+        <w:bookmarkStart w:id="11" w:name="_Toc266280202" w:displacedByCustomXml="prev"/>
+        <w:bookmarkStart w:id="12" w:name="_Toc320016168" w:displacedByCustomXml="prev"/>
         <w:p>
           <w:pPr>
             <w:pStyle w:val="Heading1"/>
@@ -7724,10 +7724,13 @@
         <w:t xml:space="preserve"> </w:t>
       </w:r>
       <w:r>
-        <w:t xml:space="preserve">– </w:t>
-      </w:r>
-      <w:r>
-        <w:t>set this to false, h</w:t>
+        <w:t xml:space="preserve">– set this to </w:t>
+      </w:r>
+      <w:r>
+        <w:t>true</w:t>
+      </w:r>
+      <w:r>
+        <w:t>, h</w:t>
       </w:r>
       <w:r>
         <w:t>ide</w:t>
@@ -7756,8 +7759,61 @@
       <w:r>
         <w:t>arking buttons</w:t>
       </w:r>
-      <w:r>
-        <w:t>;</w:t>
+    </w:p>
+    <w:p>
+      <w:pPr>
+        <w:pStyle w:val="ListParagraph"/>
+        <w:numPr>
+          <w:ilvl w:val="1"/>
+          <w:numId w:val="16"/>
+        </w:numPr>
+        <w:spacing w:after="0"/>
+        <w:textAlignment w:val="center"/>
+        <w:rPr>
+          <w:rFonts w:ascii="Calibri" w:eastAsia="Times New Roman" w:hAnsi="Calibri" w:cs="Calibri"/>
+        </w:rPr>
+      </w:pPr>
+      <w:r>
+        <w:rPr>
+          <w:rFonts w:ascii="Consolas" w:eastAsiaTheme="minorHAnsi" w:hAnsi="Consolas" w:cs="Consolas"/>
+          <w:color w:val="0000FF"/>
+          <w:sz w:val="19"/>
+          <w:szCs w:val="19"/>
+        </w:rPr>
+        <w:t>HidePortionMarking</w:t>
+      </w:r>
+      <w:r>
+        <w:rPr>
+          <w:rFonts w:ascii="Consolas" w:eastAsiaTheme="minorHAnsi" w:hAnsi="Consolas" w:cs="Consolas"/>
+          <w:color w:val="0000FF"/>
+          <w:sz w:val="19"/>
+          <w:szCs w:val="19"/>
+        </w:rPr>
+        <w:t xml:space="preserve"> </w:t>
+      </w:r>
+      <w:r>
+        <w:t>– set this to false, h</w:t>
+      </w:r>
+      <w:r>
+        <w:t>ide</w:t>
+      </w:r>
+      <w:r>
+        <w:t>s</w:t>
+      </w:r>
+      <w:r>
+        <w:t xml:space="preserve"> the </w:t>
+      </w:r>
+      <w:r>
+        <w:t>p</w:t>
+      </w:r>
+      <w:r>
+        <w:t xml:space="preserve">ortion </w:t>
+      </w:r>
+      <w:r>
+        <w:t>m</w:t>
+      </w:r>
+      <w:r>
+        <w:t>arking buttons</w:t>
       </w:r>
     </w:p>
     <w:p>
@@ -9149,6 +9205,75 @@
         <w:t xml:space="preserve"> </w:t>
       </w:r>
       <w:r>
+        <w:t xml:space="preserve">– set this to </w:t>
+      </w:r>
+      <w:r>
+        <w:t>true</w:t>
+      </w:r>
+      <w:r>
+        <w:t>, h</w:t>
+      </w:r>
+      <w:r>
+        <w:t>ide</w:t>
+      </w:r>
+      <w:r>
+        <w:t>s</w:t>
+      </w:r>
+      <w:r>
+        <w:t xml:space="preserve"> the </w:t>
+      </w:r>
+      <w:r>
+        <w:t>n</w:t>
+      </w:r>
+      <w:r>
+        <w:t>on-</w:t>
+      </w:r>
+      <w:r>
+        <w:t>p</w:t>
+      </w:r>
+      <w:r>
+        <w:t xml:space="preserve">ortion </w:t>
+      </w:r>
+      <w:r>
+        <w:t>m</w:t>
+      </w:r>
+      <w:r>
+        <w:t>arking buttons</w:t>
+      </w:r>
+    </w:p>
+    <w:p>
+      <w:pPr>
+        <w:pStyle w:val="ListParagraph"/>
+        <w:numPr>
+          <w:ilvl w:val="0"/>
+          <w:numId w:val="23"/>
+        </w:numPr>
+        <w:spacing w:after="0"/>
+        <w:textAlignment w:val="center"/>
+        <w:rPr>
+          <w:rFonts w:ascii="Calibri" w:eastAsia="Times New Roman" w:hAnsi="Calibri" w:cs="Calibri"/>
+        </w:rPr>
+      </w:pPr>
+      <w:r>
+        <w:rPr>
+          <w:rFonts w:ascii="Consolas" w:eastAsiaTheme="minorHAnsi" w:hAnsi="Consolas" w:cs="Consolas"/>
+          <w:color w:val="0000FF"/>
+          <w:sz w:val="19"/>
+          <w:szCs w:val="19"/>
+        </w:rPr>
+        <w:lastRenderedPageBreak/>
+        <w:t>HidePortionMarking</w:t>
+      </w:r>
+      <w:r>
+        <w:rPr>
+          <w:rFonts w:ascii="Consolas" w:eastAsiaTheme="minorHAnsi" w:hAnsi="Consolas" w:cs="Consolas"/>
+          <w:color w:val="0000FF"/>
+          <w:sz w:val="19"/>
+          <w:szCs w:val="19"/>
+        </w:rPr>
+        <w:t xml:space="preserve"> </w:t>
+      </w:r>
+      <w:r>
         <w:t>– set this to false, h</w:t>
       </w:r>
       <w:r>
@@ -9159,12 +9284,6 @@
       </w:r>
       <w:r>
         <w:t xml:space="preserve"> the </w:t>
-      </w:r>
-      <w:r>
-        <w:t>n</w:t>
-      </w:r>
-      <w:r>
-        <w:t>on-</w:t>
       </w:r>
       <w:r>
         <w:t>p</w:t>
@@ -9265,7 +9384,6 @@
         <w:rPr>
           <w:rFonts w:ascii="Calibri" w:eastAsia="Times New Roman" w:hAnsi="Calibri" w:cs="Calibri"/>
         </w:rPr>
-        <w:lastRenderedPageBreak/>
         <w:t>You can ignore the other piwik settings once you disable it</w:t>
       </w:r>
     </w:p>
@@ -10613,6 +10731,7 @@
           <w:szCs w:val="19"/>
           <w:highlight w:val="white"/>
         </w:rPr>
+        <w:lastRenderedPageBreak/>
         <w:t>HelpdeskEmailAddress</w:t>
       </w:r>
       <w:r>
@@ -10635,7 +10754,6 @@
           <w:sz w:val="19"/>
           <w:szCs w:val="19"/>
         </w:rPr>
-        <w:lastRenderedPageBreak/>
         <w:t>RdmSearchFolder</w:t>
       </w:r>
       <w:r>

</xml_diff>